<commit_message>
Documentation v2: full MVP status, deployment, updated compliance matrix
Co-Authored-By: Claude Fable 5 <noreply@anthropic.com>
</commit_message>
<xml_diff>
--- a/docs/Project Documentation.docx
+++ b/docs/Project Documentation.docx
@@ -13,7 +13,7 @@
         </w:rPr>
         <w:t>Insurance Quote Comparison Tool</w:t>
         <w:br/>
-        <w:t>Project Documentation</w:t>
+        <w:t>Project Documentation — MVP</w:t>
       </w:r>
     </w:p>
     <w:p>
@@ -24,13 +24,13 @@
         <w:rPr>
           <w:sz w:val="22"/>
         </w:rPr>
-        <w:t>Pilot build — AI Extraction Module and supporting application</w:t>
+        <w:t>Full MVP build, deployed and live</w:t>
         <w:br/>
-        <w:t>Prepared: 09 September 2026</w:t>
+        <w:t>Prepared: 10 September 2026</w:t>
         <w:br/>
-        <w:t>Repository: github.com/msajeeb003/UK-Insurancce (branch: main)</w:t>
+        <w:t>Repository: github.com/msajeeb003/UK-Insurancce (branch: main, CI green)</w:t>
         <w:br/>
-        <w:t>Specification: BRD v1.2 (“BRD Updated v2.pdf”) and the approved UI wireframe (“Quote Comparison Tool Wireframes.html”)</w:t>
+        <w:t>Specification: BRD v1.2, the approved UI wireframe, and the brokerage's approved presentation deck</w:t>
       </w:r>
     </w:p>
     <w:p>
@@ -51,7 +51,7 @@
         <w:rPr>
           <w:b w:val="0"/>
         </w:rPr>
-        <w:t>The Insurance Quote Comparison Tool is an internal application for a UK credit insurance brokerage. A broker uploads insurer quotation documents (PDF or Excel), the system extracts the comparison fields with an AI pipeline, the broker reviews and corrects the values on a comparison grid, and the system generates a client-facing presentation (PowerPoint and PDF) plus an editable Excel of buyer credit limits.</w:t>
+        <w:t>The Insurance Quote Comparison Tool is an internal application for a UK credit insurance brokerage. A broker signs in, sets up a client project, uploads insurer quotation documents (PDF or Excel), reviews the AI-extracted comparison on an editable grid, selects a recommendation, and generates the client presentation (PowerPoint and PDF) plus an editable Excel of buyer credit limits. Projects, uploaded documents and generated exports are stored server-side and shared by all users.</w:t>
       </w:r>
     </w:p>
     <w:p>
@@ -59,7 +59,7 @@
         <w:rPr>
           <w:b w:val="0"/>
         </w:rPr>
-        <w:t>The assigned Week-1 scope was the backend AI Extraction Module. The delivered pilot goes further: it covers the full BRD workflow Upload → Extraction → Review/Compare → Presentation export, with a frontend that follows the approved wireframe. Deployment-tier items (real login, server-side project storage, hosting) are intentionally out of this build and are listed in section 12.</w:t>
+        <w:t>Status: every numbered BRD requirement is either built and tested, or is an explicitly client-owned decision (listed in section 12). The application is deployed and running on Railway (EU region) behind HTTPS.</w:t>
       </w:r>
     </w:p>
     <w:p>
@@ -67,7 +67,7 @@
         <w:rPr>
           <w:b w:val="0"/>
         </w:rPr>
-        <w:t>Core design principles enforced throughout (BRD section 4):</w:t>
+        <w:t>Core principles enforced throughout (BRD section 4):</w:t>
       </w:r>
     </w:p>
     <w:p>
@@ -75,7 +75,7 @@
         <w:pStyle w:val="ListBullet"/>
       </w:pPr>
       <w:r>
-        <w:t>Blank, never guessed — a value not present in the document stays empty; the AI is forbidden to infer or use placeholders.</w:t>
+        <w:t>Blank, never guessed — a value not present in the document stays empty; a deterministic verification pass re-checks every extracted value against the document text.</w:t>
       </w:r>
     </w:p>
     <w:p>
@@ -83,7 +83,7 @@
         <w:pStyle w:val="ListBullet"/>
       </w:pPr>
       <w:r>
-        <w:t>Every value is source-linked to the page it came from.</w:t>
+        <w:t>Every value is source-linked — clicking a page chip opens an image of the actual stored PDF page.</w:t>
       </w:r>
     </w:p>
     <w:p>
@@ -91,7 +91,7 @@
         <w:pStyle w:val="ListBullet"/>
       </w:pPr>
       <w:r>
-        <w:t>Every field is editable by the broker; the system never recommends an insurer.</w:t>
+        <w:t>Every field is editable; the system never recommends an insurer and never writes a sentence of the client deck (all wording is fixed template or broker-written).</w:t>
       </w:r>
     </w:p>
     <w:p>
@@ -107,7 +107,7 @@
         <w:pStyle w:val="ListBullet"/>
       </w:pPr>
       <w:r>
-        <w:t>Nothing publishes automatically — export is blocked until the four key financial values are confirmed.</w:t>
+        <w:t>Nothing publishes automatically — export stays blocked (server-enforced) until the four key financial values are confirmed.</w:t>
       </w:r>
     </w:p>
     <w:p>
@@ -115,7 +115,7 @@
         <w:pStyle w:val="ListBullet"/>
       </w:pPr>
       <w:r>
-        <w:t>Configuration, not code — insurer list and terminology live in JSON files the client can edit without a release.</w:t>
+        <w:t>Configuration, not code — insurer list, entity aliases and terminology live in JSON files the client can edit without a release.</w:t>
       </w:r>
     </w:p>
     <w:p>
@@ -131,39 +131,7 @@
         <w:rPr>
           <w:b w:val="0"/>
         </w:rPr>
-        <w:t>The repository uses a modular architecture with the frontend fully separated from the backend:</w:t>
-      </w:r>
-    </w:p>
-    <w:p>
-      <w:pPr>
-        <w:pStyle w:val="ListBullet"/>
-      </w:pPr>
-      <w:r>
-        <w:t>backend/ — Python FastAPI service: extraction engines, LLM providers, verification, presentation generation, configuration, tests.</w:t>
-      </w:r>
-    </w:p>
-    <w:p>
-      <w:pPr>
-        <w:pStyle w:val="ListBullet"/>
-      </w:pPr>
-      <w:r>
-        <w:t>frontend/ — static HTML/CSS/JavaScript single-page app (no framework, no build step) served by the backend.</w:t>
-      </w:r>
-    </w:p>
-    <w:p>
-      <w:pPr>
-        <w:pStyle w:val="ListBullet"/>
-      </w:pPr>
-      <w:r>
-        <w:t>docs/ — architecture notes (ARCHITECTURE.md) and this document.</w:t>
-      </w:r>
-    </w:p>
-    <w:p>
-      <w:r>
-        <w:rPr>
-          <w:b w:val="0"/>
-        </w:rPr>
-        <w:t>The backend is organised into five packages, each with one responsibility:</w:t>
+        <w:t>Modular repository: backend/ (Python FastAPI service), frontend/ (static HTML/CSS/JavaScript, no framework, no build step), plus a Dockerfile so any container platform deploys straight from GitHub.</w:t>
       </w:r>
     </w:p>
     <w:tbl>
@@ -221,7 +189,7 @@
           </w:tcPr>
           <w:p>
             <w:r>
-              <w:t>HTTP endpoints, upload validation, error-to-HTTP mapping</w:t>
+              <w:t>HTTP endpoints: extraction, presentation, auth (login/logout/me), projects, document page images</w:t>
             </w:r>
           </w:p>
         </w:tc>
@@ -243,7 +211,7 @@
           </w:tcPr>
           <w:p>
             <w:r>
-              <w:t>Settings (.env, pydantic-settings, SecretStr) and the client-safe error hierarchy</w:t>
+              <w:t>Settings (.env, SecretStr), SQLite persistence, authentication (scrypt + sessions), error hierarchy</w:t>
             </w:r>
           </w:p>
         </w:tc>
@@ -265,7 +233,7 @@
           </w:tcPr>
           <w:p>
             <w:r>
-              <w:t>Document-to-text engines: PyMuPDF (digital PDF), Azure Document Intelligence / Docling (scanned PDF), openpyxl + xlrd (Excel)</w:t>
+              <w:t>Document-to-text engines: PyMuPDF (digital PDF), Azure DI / Docling (scanned), openpyxl + xlrd (Excel)</w:t>
             </w:r>
           </w:p>
         </w:tc>
@@ -287,7 +255,7 @@
           </w:tcPr>
           <w:p>
             <w:r>
-              <w:t>The shared extraction prompt, the Claude and OpenAI extractors, and the provider router</w:t>
+              <w:t>Shared extraction prompt, Claude and OpenAI extractors, provider router</w:t>
             </w:r>
           </w:p>
         </w:tc>
@@ -309,7 +277,7 @@
           </w:tcPr>
           <w:p>
             <w:r>
-              <w:t>Pydantic v2 schemas: the structured-output contract, API responses, presentation request</w:t>
+              <w:t>Pydantic schemas: structured-output contract, API responses, presentation request</w:t>
             </w:r>
           </w:p>
         </w:tc>
@@ -336,6 +304,28 @@
           </w:p>
         </w:tc>
       </w:tr>
+      <w:tr>
+        <w:tc>
+          <w:tcPr>
+            <w:tcW w:type="dxa" w:w="4320"/>
+          </w:tcPr>
+          <w:p>
+            <w:r>
+              <w:t>app/manage.py</w:t>
+            </w:r>
+          </w:p>
+        </w:tc>
+        <w:tc>
+          <w:tcPr>
+            <w:tcW w:type="dxa" w:w="4320"/>
+          </w:tcPr>
+          <w:p>
+            <w:r>
+              <w:t>User administration CLI (add/list/remove users — no self-registration)</w:t>
+            </w:r>
+          </w:p>
+        </w:tc>
+      </w:tr>
     </w:tbl>
     <w:p/>
     <w:p>
@@ -343,7 +333,7 @@
         <w:rPr>
           <w:b w:val="0"/>
         </w:rPr>
-        <w:t>Request flow for an extraction: the upload is validated and size-capped, routed to the right text engine (digital PDF / scanned PDF / Excel), the text is joined with explicit “=== PAGE n ===” markers, sent to the LLM under a strict structured-output schema, then every returned value is re-checked against the document text by a deterministic verification pass before the response is assembled.</w:t>
+        <w:t>Storage: one SQLite database plus a documents/exports folder under DATA_DIR — the right fit for the BRD's scale (3–4 internal users): no database server to operate, and a backup is a copy of one directory.</w:t>
       </w:r>
     </w:p>
     <w:p>
@@ -359,7 +349,7 @@
         <w:pStyle w:val="Heading2"/>
       </w:pPr>
       <w:r>
-        <w:t>3.1 Backend (Python 3.11)</w:t>
+        <w:t>3.1 Backend (Python)</w:t>
       </w:r>
     </w:p>
     <w:tbl>
@@ -421,7 +411,7 @@
           </w:tcPr>
           <w:p>
             <w:r>
-              <w:t>FastAPI</w:t>
+              <w:t>FastAPI / Uvicorn</w:t>
             </w:r>
           </w:p>
         </w:tc>
@@ -431,7 +421,7 @@
           </w:tcPr>
           <w:p>
             <w:r>
-              <w:t>0.141.1</w:t>
+              <w:t>0.141 / 0.52</w:t>
             </w:r>
           </w:p>
         </w:tc>
@@ -441,7 +431,7 @@
           </w:tcPr>
           <w:p>
             <w:r>
-              <w:t>HTTP API framework</w:t>
+              <w:t>HTTP API</w:t>
             </w:r>
           </w:p>
         </w:tc>
@@ -453,7 +443,7 @@
           </w:tcPr>
           <w:p>
             <w:r>
-              <w:t>Uvicorn</w:t>
+              <w:t>Pydantic (+settings)</w:t>
             </w:r>
           </w:p>
         </w:tc>
@@ -463,7 +453,7 @@
           </w:tcPr>
           <w:p>
             <w:r>
-              <w:t>0.52.4</w:t>
+              <w:t>2.13</w:t>
             </w:r>
           </w:p>
         </w:tc>
@@ -473,7 +463,7 @@
           </w:tcPr>
           <w:p>
             <w:r>
-              <w:t>ASGI server</w:t>
+              <w:t>Models, strict structured-output schema, typed .env</w:t>
             </w:r>
           </w:p>
         </w:tc>
@@ -485,7 +475,7 @@
           </w:tcPr>
           <w:p>
             <w:r>
-              <w:t>Pydantic</w:t>
+              <w:t>SQLite (stdlib)</w:t>
             </w:r>
           </w:p>
         </w:tc>
@@ -495,7 +485,7 @@
           </w:tcPr>
           <w:p>
             <w:r>
-              <w:t>2.13.5</w:t>
+              <w:t>—</w:t>
             </w:r>
           </w:p>
         </w:tc>
@@ -505,7 +495,7 @@
           </w:tcPr>
           <w:p>
             <w:r>
-              <w:t>Data models and the strict structured-output schema</w:t>
+              <w:t>Users, sessions, projects, retained documents, exports</w:t>
             </w:r>
           </w:p>
         </w:tc>
@@ -517,7 +507,7 @@
           </w:tcPr>
           <w:p>
             <w:r>
-              <w:t>pydantic-settings</w:t>
+              <w:t>hashlib.scrypt (stdlib)</w:t>
             </w:r>
           </w:p>
         </w:tc>
@@ -527,7 +517,7 @@
           </w:tcPr>
           <w:p>
             <w:r>
-              <w:t>2.15.0</w:t>
+              <w:t>—</w:t>
             </w:r>
           </w:p>
         </w:tc>
@@ -537,7 +527,7 @@
           </w:tcPr>
           <w:p>
             <w:r>
-              <w:t>Typed .env configuration with SecretStr secrets</w:t>
+              <w:t>Password hashing; session tokens stored as SHA-256 hashes</w:t>
             </w:r>
           </w:p>
         </w:tc>
@@ -569,7 +559,71 @@
           </w:tcPr>
           <w:p>
             <w:r>
-              <w:t>Digital PDF text extraction; also renders the PDF export</w:t>
+              <w:t>Digital PDF text, PDF export rendering, source-page images</w:t>
+            </w:r>
+          </w:p>
+        </w:tc>
+      </w:tr>
+      <w:tr>
+        <w:tc>
+          <w:tcPr>
+            <w:tcW w:type="dxa" w:w="2880"/>
+          </w:tcPr>
+          <w:p>
+            <w:r>
+              <w:t>anthropic</w:t>
+            </w:r>
+          </w:p>
+        </w:tc>
+        <w:tc>
+          <w:tcPr>
+            <w:tcW w:type="dxa" w:w="2880"/>
+          </w:tcPr>
+          <w:p>
+            <w:r>
+              <w:t>1.4.0</w:t>
+            </w:r>
+          </w:p>
+        </w:tc>
+        <w:tc>
+          <w:tcPr>
+            <w:tcW w:type="dxa" w:w="2880"/>
+          </w:tcPr>
+          <w:p>
+            <w:r>
+              <w:t>Claude structured extraction (default: claude-haiku-4-5)</w:t>
+            </w:r>
+          </w:p>
+        </w:tc>
+      </w:tr>
+      <w:tr>
+        <w:tc>
+          <w:tcPr>
+            <w:tcW w:type="dxa" w:w="2880"/>
+          </w:tcPr>
+          <w:p>
+            <w:r>
+              <w:t>openai</w:t>
+            </w:r>
+          </w:p>
+        </w:tc>
+        <w:tc>
+          <w:tcPr>
+            <w:tcW w:type="dxa" w:w="2880"/>
+          </w:tcPr>
+          <w:p>
+            <w:r>
+              <w:t>3.8.0</w:t>
+            </w:r>
+          </w:p>
+        </w:tc>
+        <w:tc>
+          <w:tcPr>
+            <w:tcW w:type="dxa" w:w="2880"/>
+          </w:tcPr>
+          <w:p>
+            <w:r>
+              <w:t>Alternative extraction provider</w:t>
             </w:r>
           </w:p>
         </w:tc>
@@ -601,7 +655,7 @@
           </w:tcPr>
           <w:p>
             <w:r>
-              <w:t>Open-source OCR for scanned PDFs (RapidOCR engine; optional install)</w:t>
+              <w:t>Open-source OCR for scanned PDFs (optional install)</w:t>
             </w:r>
           </w:p>
         </w:tc>
@@ -633,7 +687,7 @@
           </w:tcPr>
           <w:p>
             <w:r>
-              <w:t>Cloud OCR for scanned PDFs; used automatically when keys are configured</w:t>
+              <w:t>Cloud OCR, used automatically when keys are configured</w:t>
             </w:r>
           </w:p>
         </w:tc>
@@ -645,7 +699,7 @@
           </w:tcPr>
           <w:p>
             <w:r>
-              <w:t>anthropic</w:t>
+              <w:t>openpyxl / xlrd</w:t>
             </w:r>
           </w:p>
         </w:tc>
@@ -655,7 +709,7 @@
           </w:tcPr>
           <w:p>
             <w:r>
-              <w:t>1.4.0</w:t>
+              <w:t>3.1.5 / 2.0.2</w:t>
             </w:r>
           </w:p>
         </w:tc>
@@ -665,103 +719,7 @@
           </w:tcPr>
           <w:p>
             <w:r>
-              <w:t>Claude structured extraction (default provider, model claude-haiku-4-5)</w:t>
-            </w:r>
-          </w:p>
-        </w:tc>
-      </w:tr>
-      <w:tr>
-        <w:tc>
-          <w:tcPr>
-            <w:tcW w:type="dxa" w:w="2880"/>
-          </w:tcPr>
-          <w:p>
-            <w:r>
-              <w:t>openai</w:t>
-            </w:r>
-          </w:p>
-        </w:tc>
-        <w:tc>
-          <w:tcPr>
-            <w:tcW w:type="dxa" w:w="2880"/>
-          </w:tcPr>
-          <w:p>
-            <w:r>
-              <w:t>3.8.0</w:t>
-            </w:r>
-          </w:p>
-        </w:tc>
-        <w:tc>
-          <w:tcPr>
-            <w:tcW w:type="dxa" w:w="2880"/>
-          </w:tcPr>
-          <w:p>
-            <w:r>
-              <w:t>OpenAI Responses API extraction (alternative provider)</w:t>
-            </w:r>
-          </w:p>
-        </w:tc>
-      </w:tr>
-      <w:tr>
-        <w:tc>
-          <w:tcPr>
-            <w:tcW w:type="dxa" w:w="2880"/>
-          </w:tcPr>
-          <w:p>
-            <w:r>
-              <w:t>openpyxl</w:t>
-            </w:r>
-          </w:p>
-        </w:tc>
-        <w:tc>
-          <w:tcPr>
-            <w:tcW w:type="dxa" w:w="2880"/>
-          </w:tcPr>
-          <w:p>
-            <w:r>
-              <w:t>3.1.5</w:t>
-            </w:r>
-          </w:p>
-        </w:tc>
-        <w:tc>
-          <w:tcPr>
-            <w:tcW w:type="dxa" w:w="2880"/>
-          </w:tcPr>
-          <w:p>
-            <w:r>
-              <w:t>.xlsx reading and the credit-limits Excel export</w:t>
-            </w:r>
-          </w:p>
-        </w:tc>
-      </w:tr>
-      <w:tr>
-        <w:tc>
-          <w:tcPr>
-            <w:tcW w:type="dxa" w:w="2880"/>
-          </w:tcPr>
-          <w:p>
-            <w:r>
-              <w:t>xlrd</w:t>
-            </w:r>
-          </w:p>
-        </w:tc>
-        <w:tc>
-          <w:tcPr>
-            <w:tcW w:type="dxa" w:w="2880"/>
-          </w:tcPr>
-          <w:p>
-            <w:r>
-              <w:t>2.0.2</w:t>
-            </w:r>
-          </w:p>
-        </w:tc>
-        <w:tc>
-          <w:tcPr>
-            <w:tcW w:type="dxa" w:w="2880"/>
-          </w:tcPr>
-          <w:p>
-            <w:r>
-              <w:t>Legacy .xls credit-limit schedules</w:t>
+              <w:t>.xlsx and legacy .xls schedules; limits Excel export</w:t>
             </w:r>
           </w:p>
         </w:tc>
@@ -793,71 +751,7 @@
           </w:tcPr>
           <w:p>
             <w:r>
-              <w:t>PowerPoint presentation generation (Google Slides compatible)</w:t>
-            </w:r>
-          </w:p>
-        </w:tc>
-      </w:tr>
-      <w:tr>
-        <w:tc>
-          <w:tcPr>
-            <w:tcW w:type="dxa" w:w="2880"/>
-          </w:tcPr>
-          <w:p>
-            <w:r>
-              <w:t>python-multipart</w:t>
-            </w:r>
-          </w:p>
-        </w:tc>
-        <w:tc>
-          <w:tcPr>
-            <w:tcW w:type="dxa" w:w="2880"/>
-          </w:tcPr>
-          <w:p>
-            <w:r>
-              <w:t>0.0.32</w:t>
-            </w:r>
-          </w:p>
-        </w:tc>
-        <w:tc>
-          <w:tcPr>
-            <w:tcW w:type="dxa" w:w="2880"/>
-          </w:tcPr>
-          <w:p>
-            <w:r>
-              <w:t>Multipart file uploads</w:t>
-            </w:r>
-          </w:p>
-        </w:tc>
-      </w:tr>
-      <w:tr>
-        <w:tc>
-          <w:tcPr>
-            <w:tcW w:type="dxa" w:w="2880"/>
-          </w:tcPr>
-          <w:p>
-            <w:r>
-              <w:t>python-dotenv</w:t>
-            </w:r>
-          </w:p>
-        </w:tc>
-        <w:tc>
-          <w:tcPr>
-            <w:tcW w:type="dxa" w:w="2880"/>
-          </w:tcPr>
-          <w:p>
-            <w:r>
-              <w:t>1.2.3</w:t>
-            </w:r>
-          </w:p>
-        </w:tc>
-        <w:tc>
-          <w:tcPr>
-            <w:tcW w:type="dxa" w:w="2880"/>
-          </w:tcPr>
-          <w:p>
-            <w:r>
-              <w:t>.env loading</w:t>
+              <w:t>PowerPoint generation (Google Slides compatible)</w:t>
             </w:r>
           </w:p>
         </w:tc>
@@ -872,118 +766,12 @@
         <w:t>3.2 Frontend</w:t>
       </w:r>
     </w:p>
-    <w:tbl>
-      <w:tblPr>
-        <w:tblStyle w:val="TableGrid"/>
-        <w:tblW w:type="auto" w:w="0"/>
-        <w:tblLook w:firstColumn="1" w:firstRow="1" w:lastColumn="0" w:lastRow="0" w:noHBand="0" w:noVBand="1" w:val="04A0"/>
-      </w:tblPr>
-      <w:tblGrid>
-        <w:gridCol w:w="4320"/>
-        <w:gridCol w:w="4320"/>
-      </w:tblGrid>
-      <w:tr>
-        <w:tc>
-          <w:tcPr>
-            <w:tcW w:type="dxa" w:w="4320"/>
-          </w:tcPr>
-          <w:p>
-            <w:r>
-              <w:rPr>
-                <w:b/>
-              </w:rPr>
-              <w:t>Component</w:t>
-            </w:r>
-          </w:p>
-        </w:tc>
-        <w:tc>
-          <w:tcPr>
-            <w:tcW w:type="dxa" w:w="4320"/>
-          </w:tcPr>
-          <w:p>
-            <w:r>
-              <w:rPr>
-                <w:b/>
-              </w:rPr>
-              <w:t>Used for</w:t>
-            </w:r>
-          </w:p>
-        </w:tc>
-      </w:tr>
-      <w:tr>
-        <w:tc>
-          <w:tcPr>
-            <w:tcW w:type="dxa" w:w="4320"/>
-          </w:tcPr>
-          <w:p>
-            <w:r>
-              <w:t>HTML5 + CSS3 (single stylesheet)</w:t>
-            </w:r>
-          </w:p>
-        </w:tc>
-        <w:tc>
-          <w:tcPr>
-            <w:tcW w:type="dxa" w:w="4320"/>
-          </w:tcPr>
-          <w:p>
-            <w:r>
-              <w:t>Layout and theme, tokens taken from the approved wireframe</w:t>
-            </w:r>
-          </w:p>
-        </w:tc>
-      </w:tr>
-      <w:tr>
-        <w:tc>
-          <w:tcPr>
-            <w:tcW w:type="dxa" w:w="4320"/>
-          </w:tcPr>
-          <w:p>
-            <w:r>
-              <w:t>Vanilla JavaScript (ES modules)</w:t>
-            </w:r>
-          </w:p>
-        </w:tc>
-        <w:tc>
-          <w:tcPr>
-            <w:tcW w:type="dxa" w:w="4320"/>
-          </w:tcPr>
-          <w:p>
-            <w:r>
-              <w:t>All behaviour — no framework, no build step, no external dependency</w:t>
-            </w:r>
-          </w:p>
-        </w:tc>
-      </w:tr>
-      <w:tr>
-        <w:tc>
-          <w:tcPr>
-            <w:tcW w:type="dxa" w:w="4320"/>
-          </w:tcPr>
-          <w:p>
-            <w:r>
-              <w:t>Fetch API</w:t>
-            </w:r>
-          </w:p>
-        </w:tc>
-        <w:tc>
-          <w:tcPr>
-            <w:tcW w:type="dxa" w:w="4320"/>
-          </w:tcPr>
-          <w:p>
-            <w:r>
-              <w:t>Calls to the backend (/extract-quote, /generate-presentation, /insurers)</w:t>
-            </w:r>
-          </w:p>
-        </w:tc>
-      </w:tr>
-    </w:tbl>
-    <w:p/>
     <w:p>
       <w:r>
         <w:rPr>
           <w:b w:val="0"/>
         </w:rPr>
-        <w:t>Frontend modules (about 1,160 lines of JavaScript in total): constants.js (field list and screen constants), state.js (single in-memory application state), views.js (screen renderers), api.js (backend calls, upload de-duplication, downloads), demo.js (sample data loader), main.js (routing and event delegation).</w:t>
+        <w:t>HTML5 + CSS3 + vanilla JavaScript ES modules — no framework, no dependency, no build step. Six modules (~1,150 lines): constants, state (server-synced), views, api, main. All copy verified word-for-word against the approved wireframe.</w:t>
       </w:r>
     </w:p>
     <w:p>
@@ -991,197 +779,7 @@
         <w:pStyle w:val="Heading2"/>
       </w:pPr>
       <w:r>
-        <w:t>3.3 Development and quality tooling</w:t>
-      </w:r>
-    </w:p>
-    <w:tbl>
-      <w:tblPr>
-        <w:tblStyle w:val="TableGrid"/>
-        <w:tblW w:type="auto" w:w="0"/>
-        <w:tblLook w:firstColumn="1" w:firstRow="1" w:lastColumn="0" w:lastRow="0" w:noHBand="0" w:noVBand="1" w:val="04A0"/>
-      </w:tblPr>
-      <w:tblGrid>
-        <w:gridCol w:w="2880"/>
-        <w:gridCol w:w="2880"/>
-        <w:gridCol w:w="2880"/>
-      </w:tblGrid>
-      <w:tr>
-        <w:tc>
-          <w:tcPr>
-            <w:tcW w:type="dxa" w:w="2880"/>
-          </w:tcPr>
-          <w:p>
-            <w:r>
-              <w:rPr>
-                <w:b/>
-              </w:rPr>
-              <w:t>Tool</w:t>
-            </w:r>
-          </w:p>
-        </w:tc>
-        <w:tc>
-          <w:tcPr>
-            <w:tcW w:type="dxa" w:w="2880"/>
-          </w:tcPr>
-          <w:p>
-            <w:r>
-              <w:rPr>
-                <w:b/>
-              </w:rPr>
-              <w:t>Version</w:t>
-            </w:r>
-          </w:p>
-        </w:tc>
-        <w:tc>
-          <w:tcPr>
-            <w:tcW w:type="dxa" w:w="2880"/>
-          </w:tcPr>
-          <w:p>
-            <w:r>
-              <w:rPr>
-                <w:b/>
-              </w:rPr>
-              <w:t>Used for</w:t>
-            </w:r>
-          </w:p>
-        </w:tc>
-      </w:tr>
-      <w:tr>
-        <w:tc>
-          <w:tcPr>
-            <w:tcW w:type="dxa" w:w="2880"/>
-          </w:tcPr>
-          <w:p>
-            <w:r>
-              <w:t>pytest</w:t>
-            </w:r>
-          </w:p>
-        </w:tc>
-        <w:tc>
-          <w:tcPr>
-            <w:tcW w:type="dxa" w:w="2880"/>
-          </w:tcPr>
-          <w:p>
-            <w:r>
-              <w:t>8.3.4</w:t>
-            </w:r>
-          </w:p>
-        </w:tc>
-        <w:tc>
-          <w:tcPr>
-            <w:tcW w:type="dxa" w:w="2880"/>
-          </w:tcPr>
-          <w:p>
-            <w:r>
-              <w:t>Test suite (73 tests)</w:t>
-            </w:r>
-          </w:p>
-        </w:tc>
-      </w:tr>
-      <w:tr>
-        <w:tc>
-          <w:tcPr>
-            <w:tcW w:type="dxa" w:w="2880"/>
-          </w:tcPr>
-          <w:p>
-            <w:r>
-              <w:t>httpx</w:t>
-            </w:r>
-          </w:p>
-        </w:tc>
-        <w:tc>
-          <w:tcPr>
-            <w:tcW w:type="dxa" w:w="2880"/>
-          </w:tcPr>
-          <w:p>
-            <w:r>
-              <w:t>0.28.1</w:t>
-            </w:r>
-          </w:p>
-        </w:tc>
-        <w:tc>
-          <w:tcPr>
-            <w:tcW w:type="dxa" w:w="2880"/>
-          </w:tcPr>
-          <w:p>
-            <w:r>
-              <w:t>API tests through the FastAPI test client</w:t>
-            </w:r>
-          </w:p>
-        </w:tc>
-      </w:tr>
-      <w:tr>
-        <w:tc>
-          <w:tcPr>
-            <w:tcW w:type="dxa" w:w="2880"/>
-          </w:tcPr>
-          <w:p>
-            <w:r>
-              <w:t>Ruff</w:t>
-            </w:r>
-          </w:p>
-        </w:tc>
-        <w:tc>
-          <w:tcPr>
-            <w:tcW w:type="dxa" w:w="2880"/>
-          </w:tcPr>
-          <w:p>
-            <w:r>
-              <w:t>0.9.4</w:t>
-            </w:r>
-          </w:p>
-        </w:tc>
-        <w:tc>
-          <w:tcPr>
-            <w:tcW w:type="dxa" w:w="2880"/>
-          </w:tcPr>
-          <w:p>
-            <w:r>
-              <w:t>Linting (currently clean)</w:t>
-            </w:r>
-          </w:p>
-        </w:tc>
-      </w:tr>
-      <w:tr>
-        <w:tc>
-          <w:tcPr>
-            <w:tcW w:type="dxa" w:w="2880"/>
-          </w:tcPr>
-          <w:p>
-            <w:r>
-              <w:t>xlwt</w:t>
-            </w:r>
-          </w:p>
-        </w:tc>
-        <w:tc>
-          <w:tcPr>
-            <w:tcW w:type="dxa" w:w="2880"/>
-          </w:tcPr>
-          <w:p>
-            <w:r>
-              <w:t>1.3.0</w:t>
-            </w:r>
-          </w:p>
-        </w:tc>
-        <w:tc>
-          <w:tcPr>
-            <w:tcW w:type="dxa" w:w="2880"/>
-          </w:tcPr>
-          <w:p>
-            <w:r>
-              <w:t>Writes legacy .xls fixtures inside tests</w:t>
-            </w:r>
-          </w:p>
-        </w:tc>
-      </w:tr>
-    </w:tbl>
-    <w:p/>
-    <w:p>
-      <w:pPr>
-        <w:pStyle w:val="Heading1"/>
-      </w:pPr>
-      <w:r>
-        <w:t>4. Repository structure</w:t>
+        <w:t>3.3 Quality tooling</w:t>
       </w:r>
     </w:p>
     <w:p>
@@ -1189,95 +787,15 @@
         <w:rPr>
           <w:b w:val="0"/>
         </w:rPr>
-        <w:t>backend/app — 2,675 lines of application Python; backend/tests — 1,081 lines of test Python; frontend — about 1,400 lines of HTML/CSS/JS.</w:t>
+        <w:t>pytest (83 tests), Ruff (clean), GitHub Actions CI (green), httpx test client. Deployment: Dockerfile (Railway/Render/any container host) and a VPS guide (DEPLOY.md).</w:t>
       </w:r>
     </w:p>
-    <w:p>
-      <w:pPr>
-        <w:pStyle w:val="NoSpacing"/>
-      </w:pPr>
-      <w:r>
-        <w:rPr>
-          <w:rFonts w:ascii="Consolas" w:hAnsi="Consolas"/>
-          <w:b w:val="0"/>
-          <w:sz w:val="18"/>
-        </w:rPr>
-        <w:t>backend/</w:t>
-        <w:br/>
-        <w:t xml:space="preserve">  app/</w:t>
-        <w:br/>
-        <w:t xml:space="preserve">    main.py                 FastAPI app, security headers, rate limiting, static serving</w:t>
-        <w:br/>
-        <w:t xml:space="preserve">    api/routes.py           /health, /insurers, /extract-quote, /generate-presentation</w:t>
-        <w:br/>
-        <w:t xml:space="preserve">    core/config.py          Settings (.env at repository root)</w:t>
-        <w:br/>
-        <w:t xml:space="preserve">    core/errors.py          Client-safe PipelineError hierarchy -&gt; HTTP statuses</w:t>
-        <w:br/>
-        <w:t xml:space="preserve">    extraction/detector.py  Digital-vs-scanned PDF detection</w:t>
-        <w:br/>
-        <w:t xml:space="preserve">    extraction/pymupdf_extractor.py   Digital PDF text</w:t>
-        <w:br/>
-        <w:t xml:space="preserve">    extraction/azure_extractor.py     Azure Document Intelligence OCR</w:t>
-        <w:br/>
-        <w:t xml:space="preserve">    extraction/docling_extractor.py   Open-source OCR fallback</w:t>
-        <w:br/>
-        <w:t xml:space="preserve">    extraction/excel_extractor.py     .xlsx and legacy .xls schedules</w:t>
-        <w:br/>
-        <w:t xml:space="preserve">    extraction/base.py      Page model, text cleaning, page tagging</w:t>
-        <w:br/>
-        <w:t xml:space="preserve">    llm/prompt.py           The shared extraction prompt (one contract for every provider)</w:t>
-        <w:br/>
-        <w:t xml:space="preserve">    llm/anthropic_extractor.py        Claude structured extraction</w:t>
-        <w:br/>
-        <w:t xml:space="preserve">    llm/openai_extractor.py           OpenAI structured extraction</w:t>
-        <w:br/>
-        <w:t xml:space="preserve">    llm/router.py           Provider selection (auto / anthropic / openai)</w:t>
-        <w:br/>
-        <w:t xml:space="preserve">    models/schemas.py       Extraction schema, review summary, API response</w:t>
-        <w:br/>
-        <w:t xml:space="preserve">    models/presentation.py  Presentation request models and the 16-row list</w:t>
-        <w:br/>
-        <w:t xml:space="preserve">    services/pipeline.py    Orchestration of the whole extraction flow</w:t>
-        <w:br/>
-        <w:t xml:space="preserve">    services/library.py     insurers.json + terminology.json loading (hot reload)</w:t>
-        <w:br/>
-        <w:t xml:space="preserve">    services/verification.py          Deterministic anti-hallucination check</w:t>
-        <w:br/>
-        <w:t xml:space="preserve">    services/presentation.py          PPTX + PDF + credit-limits XLSX rendering</w:t>
-        <w:br/>
-        <w:t xml:space="preserve">  config/</w:t>
-        <w:br/>
-        <w:t xml:space="preserve">    insurers.json           Standing insurer list, aliases, debt-collection rule</w:t>
-        <w:br/>
-        <w:t xml:space="preserve">    terminology.json        Field -&gt; insurer wordings mapping library</w:t>
-        <w:br/>
-        <w:t xml:space="preserve">  tests/                    11 test files, 73 tests</w:t>
-        <w:br/>
-        <w:t>frontend/</w:t>
-        <w:br/>
-        <w:t xml:space="preserve">  index.html, css/styles.css, js/ (6 ES modules)</w:t>
-        <w:br/>
-        <w:t>docs/</w:t>
-        <w:br/>
-        <w:t xml:space="preserve">  ARCHITECTURE.md           Pipeline diagram and design notes</w:t>
-      </w:r>
-    </w:p>
-    <w:p/>
     <w:p>
       <w:pPr>
         <w:pStyle w:val="Heading1"/>
       </w:pPr>
       <w:r>
-        <w:t>5. The AI extraction pipeline in detail</w:t>
-      </w:r>
-    </w:p>
-    <w:p>
-      <w:r>
-        <w:rPr>
-          <w:b w:val="0"/>
-        </w:rPr>
-        <w:t>POST /extract-quote accepts one document (PDF, .xlsx or legacy .xls, up to 25 MB / 60 pages) and returns structured JSON. The steps:</w:t>
+        <w:t>4. The AI extraction pipeline</w:t>
       </w:r>
     </w:p>
     <w:tbl>
@@ -1335,7 +853,7 @@
           </w:tcPr>
           <w:p>
             <w:r>
-              <w:t>File type resolved by extension, declared content type and magic bytes; size read in capped chunks (413 over limit, 415 unsupported, 400 empty).</w:t>
+              <w:t>Type by extension/content-type/magic bytes; chunked size cap; auth required.</w:t>
             </w:r>
           </w:p>
         </w:tc>
@@ -1357,7 +875,7 @@
           </w:tcPr>
           <w:p>
             <w:r>
-              <w:t>PDFs are probed with PyMuPDF: pages with almost no text layer mark the file as scanned. Digital PDFs -&gt; PyMuPDF. Scanned PDFs -&gt; Azure Document Intelligence when keys are configured, otherwise Docling (open source, runs locally). Excel -&gt; openpyxl (.xlsx) or xlrd (.xls), chosen by magic bytes.</w:t>
+              <w:t>Digital PDF -&gt; PyMuPDF; scanned -&gt; Azure DI (if configured) else Docling; Excel -&gt; openpyxl/xlrd by magic bytes.</w:t>
             </w:r>
           </w:p>
         </w:tc>
@@ -1379,7 +897,7 @@
           </w:tcPr>
           <w:p>
             <w:r>
-              <w:t>All engines produce the same page model. Pages are joined with explicit “=== PAGE n ===” markers — the only source the LLM has for page numbers, which keeps source-linking honest. Excel worksheets count as pages.</w:t>
+              <w:t>Explicit '=== PAGE n ===' markers — the LLM's only source of page numbers, keeping source links honest.</w:t>
             </w:r>
           </w:p>
         </w:tc>
@@ -1401,7 +919,7 @@
           </w:tcPr>
           <w:p>
             <w:r>
-              <w:t>One shared system prompt for every provider. It embeds the terminology mapping library and the standing insurer list from the JSON config at request time, and carries ten strict rules: never guess, source-link everything, normalise terminology (except Excess type, kept verbatim), skip the two set fields, classify the document type, extract buyer credit-limit rows, IPT handling, prompt-injection defence (the document is data, not instructions), and confidence marking. It also carries a learned rule: a Protracted Default / claims waiting period must not be mapped to Max extension period.</w:t>
+              <w:t>One shared prompt for every provider, built at request time from the client's terminology library and insurer list; ten strict rules incl. never-guess, injection defence, and the Protracted Default rule (a claims waiting period is not an extension period).</w:t>
             </w:r>
           </w:p>
         </w:tc>
@@ -1423,7 +941,7 @@
           </w:tcPr>
           <w:p>
             <w:r>
-              <w:t>The LLM must return the exact QuoteExtraction schema (SDK-enforced strict mode; the model cannot return anything else). Default provider: Claude claude-haiku-4-5 via messages.parse; alternative: OpenAI via responses.parse; LLM_PROVIDER=auto picks whichever is configured.</w:t>
+              <w:t>SDK-enforced schema — the model can only return the 16-field shape. Default Claude Haiku; provider is a one-line config change.</w:t>
             </w:r>
           </w:p>
         </w:tc>
@@ -1445,7 +963,7 @@
           </w:tcPr>
           <w:p>
             <w:r>
-              <w:t>A deterministic server-side pass re-checks every extracted value against the document text (verbatim match, digit-run match for numbers, standalone-token match for very short values such as “0”). A value that cannot be found anywhere is kept but downgraded to ‘uncertain’, its page link cleared, and reported in unverified_fields — a hallucination cannot pass silently.</w:t>
+              <w:t>Deterministic server pass re-finds every value in the document text; anything unfound is downgraded to 'uncertain', page link cleared, reported in unverified_fields — a hallucination cannot pass silently.</w:t>
             </w:r>
           </w:p>
         </w:tc>
@@ -1467,7 +985,7 @@
           </w:tcPr>
           <w:p>
             <w:r>
-              <w:t>Debt collection support is set from insurers.json (Allianz Trade / Atradius / Coface -&gt; Included, all others -&gt; Outsourced), matched through document-wording aliases. Type of policy is broker-selected in the UI.</w:t>
+              <w:t>Debt collection from insurers.json (Allianz/Atradius/Coface -&gt; Included), matched through entity aliases; Type of policy broker-set.</w:t>
             </w:r>
           </w:p>
         </w:tc>
@@ -1479,7 +997,7 @@
           </w:tcPr>
           <w:p>
             <w:r>
-              <w:t>8. Review summary</w:t>
+              <w:t>8. Review summary + retention</w:t>
             </w:r>
           </w:p>
         </w:tc>
@@ -1489,7 +1007,7 @@
           </w:tcPr>
           <w:p>
             <w:r>
-              <w:t>The server (never the LLM) computes missing_fields, uncertain_fields, unverified_fields and the confirm-required list, so the UI highlights and the export gate rest on deterministic data.</w:t>
+              <w:t>Server computes missing/uncertain/unverified and the confirm list; the uploaded file is retained against the project.</w:t>
             </w:r>
           </w:p>
         </w:tc>
@@ -1501,7 +1019,7 @@
         <w:pStyle w:val="Heading2"/>
       </w:pPr>
       <w:r>
-        <w:t>5.1 The 16 extracted / set comparison fields (BRD 2.3)</w:t>
+        <w:t>4.1 Insurer identification and entity aliases</w:t>
       </w:r>
     </w:p>
     <w:p>
@@ -1509,7 +1027,7 @@
         <w:rPr>
           <w:b w:val="0"/>
         </w:rPr>
-        <w:t>Insurer, Type of policy (set), Annual turnover, Premium rate, Estimated annual premium (exc IPT), Minimum annual premium, Credit limit charges, Debt collection support (set), Indemnity, Excess, Excess type (kept in the insurer's original wording), Max annual liability, Discretionary limit, Max terms of payment, Max extension period, Additional info (free format). In addition the pipeline extracts every buyer credit-limit row (buyer name, company number, limit required, limit offered, page) whether the schedule is a standalone document or an addendum inside a quote.</w:t>
+        <w:t>Insurers print their legal entity names, not their brand names. config/insurers.json maps document wordings to the standing list — e.g. 'QBE UK LIMITED' -&gt; QBE, 'Compagnie Française d'Assurance...' -&gt; Coface (its full legal name), 'Euler Hermes' -&gt; Allianz Trade, 'HCC International Insurance Company plc' -&gt; Tokio Marine HCC, and 'The Marine Insurance Company Limited' -&gt; Cartan (Cartan Trade UK is its Appointed Representative — source: cartantrade.com/legal-notice). Every match is shown on the upload card ('matched: ...') so a broker verifies it by eye; an unmatched insurer is never guessed — it keeps its own name and the rule default. The alias list is client-editable configuration and should be signed off by the client.</w:t>
       </w:r>
     </w:p>
     <w:p>
@@ -1517,121 +1035,71 @@
         <w:pStyle w:val="Heading1"/>
       </w:pPr>
       <w:r>
-        <w:t>6. Configuration (no code changes needed)</w:t>
+        <w:t>5. Authentication and storage (BRD 2.9 / 2.10)</w:t>
       </w:r>
     </w:p>
-    <w:tbl>
-      <w:tblPr>
-        <w:tblStyle w:val="TableGrid"/>
-        <w:tblW w:type="auto" w:w="0"/>
-        <w:tblLook w:firstColumn="1" w:firstRow="1" w:lastColumn="0" w:lastRow="0" w:noHBand="0" w:noVBand="1" w:val="04A0"/>
-      </w:tblPr>
-      <w:tblGrid>
-        <w:gridCol w:w="4320"/>
-        <w:gridCol w:w="4320"/>
-      </w:tblGrid>
-      <w:tr>
-        <w:tc>
-          <w:tcPr>
-            <w:tcW w:type="dxa" w:w="4320"/>
-          </w:tcPr>
-          <w:p>
-            <w:r>
-              <w:rPr>
-                <w:b/>
-              </w:rPr>
-              <w:t>File / variable</w:t>
-            </w:r>
-          </w:p>
-        </w:tc>
-        <w:tc>
-          <w:tcPr>
-            <w:tcW w:type="dxa" w:w="4320"/>
-          </w:tcPr>
-          <w:p>
-            <w:r>
-              <w:rPr>
-                <w:b/>
-              </w:rPr>
-              <w:t>Purpose</w:t>
-            </w:r>
-          </w:p>
-        </w:tc>
-      </w:tr>
-      <w:tr>
-        <w:tc>
-          <w:tcPr>
-            <w:tcW w:type="dxa" w:w="4320"/>
-          </w:tcPr>
-          <w:p>
-            <w:r>
-              <w:t>backend/config/terminology.json</w:t>
-            </w:r>
-          </w:p>
-        </w:tc>
-        <w:tc>
-          <w:tcPr>
-            <w:tcW w:type="dxa" w:w="4320"/>
-          </w:tcPr>
-          <w:p>
-            <w:r>
-              <w:t>The BRD 2.3 mapping library: field -&gt; insurer wordings. Hot-reloaded on change; extending it never touches code.</w:t>
-            </w:r>
-          </w:p>
-        </w:tc>
-      </w:tr>
-      <w:tr>
-        <w:tc>
-          <w:tcPr>
-            <w:tcW w:type="dxa" w:w="4320"/>
-          </w:tcPr>
-          <w:p>
-            <w:r>
-              <w:t>backend/config/insurers.json</w:t>
-            </w:r>
-          </w:p>
-        </w:tc>
-        <w:tc>
-          <w:tcPr>
-            <w:tcW w:type="dxa" w:w="4320"/>
-          </w:tcPr>
-          <w:p>
-            <w:r>
-              <w:t>Standing insurer list with aliases and the debt-collection rule. Hot-reloaded.</w:t>
-            </w:r>
-          </w:p>
-        </w:tc>
-      </w:tr>
-      <w:tr>
-        <w:tc>
-          <w:tcPr>
-            <w:tcW w:type="dxa" w:w="4320"/>
-          </w:tcPr>
-          <w:p>
-            <w:r>
-              <w:t>.env (repository root)</w:t>
-            </w:r>
-          </w:p>
-        </w:tc>
-        <w:tc>
-          <w:tcPr>
-            <w:tcW w:type="dxa" w:w="4320"/>
-          </w:tcPr>
-          <w:p>
-            <w:r>
-              <w:t>Secrets and tuning: ANTHROPIC_API_KEY, OPENAI_API_KEY, AZURE_DI_ENDPOINT/KEY, LLM_PROVIDER (auto/anthropic/openai), model names, upload/page limits.</w:t>
-            </w:r>
-          </w:p>
-        </w:tc>
-      </w:tr>
-    </w:tbl>
-    <w:p/>
+    <w:p>
+      <w:pPr>
+        <w:pStyle w:val="ListBullet"/>
+      </w:pPr>
+      <w:r>
+        <w:t>Email + password sign-in; no self-registration. First user seeded from ADMIN_EMAIL/ADMIN_PASSWORD; further users via the manage CLI. Passwords scrypt-hashed; sessions are HttpOnly cookies whose tokens are stored only as hashes.</w:t>
+      </w:r>
+    </w:p>
+    <w:p>
+      <w:pPr>
+        <w:pStyle w:val="ListBullet"/>
+      </w:pPr>
+      <w:r>
+        <w:t>Every data endpoint returns 401 without a session (verified live on the deployed server).</w:t>
+      </w:r>
+    </w:p>
+    <w:p>
+      <w:pPr>
+        <w:pStyle w:val="ListBullet"/>
+      </w:pPr>
+      <w:r>
+        <w:t>Projects are stored server-side, shared by all users, reopenable to the review screen; every edit auto-saves (debounced).</w:t>
+      </w:r>
+    </w:p>
+    <w:p>
+      <w:pPr>
+        <w:pStyle w:val="ListBullet"/>
+      </w:pPr>
+      <w:r>
+        <w:t>Uploaded documents are retained per project; the review grid's page chips open the real stored PDF page.</w:t>
+      </w:r>
+    </w:p>
+    <w:p>
+      <w:pPr>
+        <w:pStyle w:val="ListBullet"/>
+      </w:pPr>
+      <w:r>
+        <w:t>Generated exports are retained; the project list carries PPT/PDF download links. Regenerating replaces the file (no versioning — BRD 2.9).</w:t>
+      </w:r>
+    </w:p>
+    <w:p>
+      <w:pPr>
+        <w:pStyle w:val="ListBullet"/>
+      </w:pPr>
+      <w:r>
+        <w:t>Deleting a project removes its rows, documents and exports (BRD 2.11 deletion on request).</w:t>
+      </w:r>
+    </w:p>
+    <w:p>
+      <w:pPr>
+        <w:pStyle w:val="Heading1"/>
+      </w:pPr>
+      <w:r>
+        <w:t>6. Presentation export (BRD 2.8)</w:t>
+      </w:r>
+    </w:p>
     <w:p>
       <w:r>
         <w:rPr>
           <w:b w:val="0"/>
         </w:rPr>
-        <w:t>GET /health reports which providers and OCR engines are configured without exposing any secret.</w:t>
+        <w:t>The deck is the brokerage's approved template, rebuilt exactly: the navy/teal brand, cover '‹Client› - [Renewal] Credit Insurance Presentation', About Us, Feedback of Terms (fixed Insurance Act 2015 'Duty of Fair Presentation' wording, insurers approached, auto-generated declined line), Terms Comparison (the 16 BRD rows with the sample deck's labels, recommended column highlighted, expiring column greyed), Credit Limits with a computed Total row, 'Our understanding of your demands &amp; needs' with the merged recommendation and 'Our status' FCA wording, Contact Us. Outputs: editable PPTX (opens cleanly in Google Slides), PDF, and the limits table as Excel. The 2.5 gate is enforced server-side (HTTP 409 until the four key values are confirmed). No AI-written text appears anywhere in the deck — every sentence is fixed template, broker-written, or reviewed data.</w:t>
       </w:r>
     </w:p>
     <w:p>
@@ -1676,7 +1144,7 @@
               <w:rPr>
                 <w:b/>
               </w:rPr>
-              <w:t>Method</w:t>
+              <w:t>Auth</w:t>
             </w:r>
           </w:p>
         </w:tc>
@@ -1701,7 +1169,7 @@
           </w:tcPr>
           <w:p>
             <w:r>
-              <w:t>/health</w:t>
+              <w:t>GET /health</w:t>
             </w:r>
           </w:p>
         </w:tc>
@@ -1711,7 +1179,7 @@
           </w:tcPr>
           <w:p>
             <w:r>
-              <w:t>GET</w:t>
+              <w:t>open</w:t>
             </w:r>
           </w:p>
         </w:tc>
@@ -1721,7 +1189,7 @@
           </w:tcPr>
           <w:p>
             <w:r>
-              <w:t>Liveness and configuration sanity (active LLM, OCR availability)</w:t>
+              <w:t>Liveness + configuration sanity</w:t>
             </w:r>
           </w:p>
         </w:tc>
@@ -1733,7 +1201,7 @@
           </w:tcPr>
           <w:p>
             <w:r>
-              <w:t>/insurers</w:t>
+              <w:t>GET /insurers</w:t>
             </w:r>
           </w:p>
         </w:tc>
@@ -1743,7 +1211,7 @@
           </w:tcPr>
           <w:p>
             <w:r>
-              <w:t>GET</w:t>
+              <w:t>open</w:t>
             </w:r>
           </w:p>
         </w:tc>
@@ -1753,7 +1221,7 @@
           </w:tcPr>
           <w:p>
             <w:r>
-              <w:t>The standing insurer list and debt rule for the UI</w:t>
+              <w:t>Standing list + debt rule (config)</w:t>
             </w:r>
           </w:p>
         </w:tc>
@@ -1765,7 +1233,7 @@
           </w:tcPr>
           <w:p>
             <w:r>
-              <w:t>/extract-quote</w:t>
+              <w:t>POST /auth/login · /auth/logout · GET /auth/me</w:t>
             </w:r>
           </w:p>
         </w:tc>
@@ -1775,7 +1243,7 @@
           </w:tcPr>
           <w:p>
             <w:r>
-              <w:t>POST</w:t>
+              <w:t>—</w:t>
             </w:r>
           </w:p>
         </w:tc>
@@ -1785,7 +1253,7 @@
           </w:tcPr>
           <w:p>
             <w:r>
-              <w:t>Upload one document; returns meta, review summary, set fields and the full extraction with page links and confidence flags. Optional ?engine= override (auto/digital/azure/docling).</w:t>
+              <w:t>Session management</w:t>
             </w:r>
           </w:p>
         </w:tc>
@@ -1797,7 +1265,7 @@
           </w:tcPr>
           <w:p>
             <w:r>
-              <w:t>/generate-presentation</w:t>
+              <w:t>POST /extract-quote</w:t>
             </w:r>
           </w:p>
         </w:tc>
@@ -1807,7 +1275,7 @@
           </w:tcPr>
           <w:p>
             <w:r>
-              <w:t>POST</w:t>
+              <w:t>required</w:t>
             </w:r>
           </w:p>
         </w:tc>
@@ -1817,7 +1285,103 @@
           </w:tcPr>
           <w:p>
             <w:r>
-              <w:t>Render the reviewed project as ?format=pptx (editable PowerPoint), pdf, or limits-xlsx (buyer credit-limit Excel). Returns 409 until the four BRD 2.5 values are confirmed.</w:t>
+              <w:t>Upload -&gt; structured JSON; document retained when a project id is sent</w:t>
+            </w:r>
+          </w:p>
+        </w:tc>
+      </w:tr>
+      <w:tr>
+        <w:tc>
+          <w:tcPr>
+            <w:tcW w:type="dxa" w:w="2880"/>
+          </w:tcPr>
+          <w:p>
+            <w:r>
+              <w:t>POST /generate-presentation</w:t>
+            </w:r>
+          </w:p>
+        </w:tc>
+        <w:tc>
+          <w:tcPr>
+            <w:tcW w:type="dxa" w:w="2880"/>
+          </w:tcPr>
+          <w:p>
+            <w:r>
+              <w:t>required</w:t>
+            </w:r>
+          </w:p>
+        </w:tc>
+        <w:tc>
+          <w:tcPr>
+            <w:tcW w:type="dxa" w:w="2880"/>
+          </w:tcPr>
+          <w:p>
+            <w:r>
+              <w:t>Reviewed state -&gt; pptx / pdf / limits-xlsx; retained per project</w:t>
+            </w:r>
+          </w:p>
+        </w:tc>
+      </w:tr>
+      <w:tr>
+        <w:tc>
+          <w:tcPr>
+            <w:tcW w:type="dxa" w:w="2880"/>
+          </w:tcPr>
+          <w:p>
+            <w:r>
+              <w:t>GET/POST/DELETE /projects…</w:t>
+            </w:r>
+          </w:p>
+        </w:tc>
+        <w:tc>
+          <w:tcPr>
+            <w:tcW w:type="dxa" w:w="2880"/>
+          </w:tcPr>
+          <w:p>
+            <w:r>
+              <w:t>required</w:t>
+            </w:r>
+          </w:p>
+        </w:tc>
+        <w:tc>
+          <w:tcPr>
+            <w:tcW w:type="dxa" w:w="2880"/>
+          </w:tcPr>
+          <w:p>
+            <w:r>
+              <w:t>List, save, reopen, delete; export downloads</w:t>
+            </w:r>
+          </w:p>
+        </w:tc>
+      </w:tr>
+      <w:tr>
+        <w:tc>
+          <w:tcPr>
+            <w:tcW w:type="dxa" w:w="2880"/>
+          </w:tcPr>
+          <w:p>
+            <w:r>
+              <w:t>GET /documents/{id}/page/{n}</w:t>
+            </w:r>
+          </w:p>
+        </w:tc>
+        <w:tc>
+          <w:tcPr>
+            <w:tcW w:type="dxa" w:w="2880"/>
+          </w:tcPr>
+          <w:p>
+            <w:r>
+              <w:t>required</w:t>
+            </w:r>
+          </w:p>
+        </w:tc>
+        <w:tc>
+          <w:tcPr>
+            <w:tcW w:type="dxa" w:w="2880"/>
+          </w:tcPr>
+          <w:p>
+            <w:r>
+              <w:t>Stored PDF page as an image (S5 source view)</w:t>
             </w:r>
           </w:p>
         </w:tc>
@@ -1829,7 +1393,7 @@
         <w:rPr>
           <w:b w:val="0"/>
         </w:rPr>
-        <w:t>Security measures on the API: per-IP rate limiting, strict Content Security Policy and security headers, capped upload size read in chunks, client-safe error messages (internals only in server logs), secrets held as SecretStr, prompt-injection fencing around document text, and the export gate enforced server-side so no client can bypass it.</w:t>
+        <w:t>Hardening: per-IP rate limiting, strict CSP and security headers (verified live), chunked upload caps, client-safe errors, SecretStr secrets, prompt-injection fencing, server-side export gate.</w:t>
       </w:r>
     </w:p>
     <w:p>
@@ -1837,349 +1401,7 @@
         <w:pStyle w:val="Heading1"/>
       </w:pPr>
       <w:r>
-        <w:t>8. Frontend screens (wireframe + BRD section 3)</w:t>
-      </w:r>
-    </w:p>
-    <w:tbl>
-      <w:tblPr>
-        <w:tblStyle w:val="TableGrid"/>
-        <w:tblW w:type="auto" w:w="0"/>
-        <w:tblLook w:firstColumn="1" w:firstRow="1" w:lastColumn="0" w:lastRow="0" w:noHBand="0" w:noVBand="1" w:val="04A0"/>
-      </w:tblPr>
-      <w:tblGrid>
-        <w:gridCol w:w="2880"/>
-        <w:gridCol w:w="2880"/>
-        <w:gridCol w:w="2880"/>
-      </w:tblGrid>
-      <w:tr>
-        <w:tc>
-          <w:tcPr>
-            <w:tcW w:type="dxa" w:w="2880"/>
-          </w:tcPr>
-          <w:p>
-            <w:r>
-              <w:rPr>
-                <w:b/>
-              </w:rPr>
-              <w:t>Screen</w:t>
-            </w:r>
-          </w:p>
-        </w:tc>
-        <w:tc>
-          <w:tcPr>
-            <w:tcW w:type="dxa" w:w="2880"/>
-          </w:tcPr>
-          <w:p>
-            <w:r>
-              <w:rPr>
-                <w:b/>
-              </w:rPr>
-              <w:t>Status</w:t>
-            </w:r>
-          </w:p>
-        </w:tc>
-        <w:tc>
-          <w:tcPr>
-            <w:tcW w:type="dxa" w:w="2880"/>
-          </w:tcPr>
-          <w:p>
-            <w:r>
-              <w:rPr>
-                <w:b/>
-              </w:rPr>
-              <w:t>Notes</w:t>
-            </w:r>
-          </w:p>
-        </w:tc>
-      </w:tr>
-      <w:tr>
-        <w:tc>
-          <w:tcPr>
-            <w:tcW w:type="dxa" w:w="2880"/>
-          </w:tcPr>
-          <w:p>
-            <w:r>
-              <w:t>S1 Login</w:t>
-            </w:r>
-          </w:p>
-        </w:tc>
-        <w:tc>
-          <w:tcPr>
-            <w:tcW w:type="dxa" w:w="2880"/>
-          </w:tcPr>
-          <w:p>
-            <w:r>
-              <w:t>Stub</w:t>
-            </w:r>
-          </w:p>
-        </w:tc>
-        <w:tc>
-          <w:tcPr>
-            <w:tcW w:type="dxa" w:w="2880"/>
-          </w:tcPr>
-          <w:p>
-            <w:r>
-              <w:t>Screen exists per wireframe; real authentication is a deployment item.</w:t>
-            </w:r>
-          </w:p>
-        </w:tc>
-      </w:tr>
-      <w:tr>
-        <w:tc>
-          <w:tcPr>
-            <w:tcW w:type="dxa" w:w="2880"/>
-          </w:tcPr>
-          <w:p>
-            <w:r>
-              <w:t>S2 Project list</w:t>
-            </w:r>
-          </w:p>
-        </w:tc>
-        <w:tc>
-          <w:tcPr>
-            <w:tcW w:type="dxa" w:w="2880"/>
-          </w:tcPr>
-          <w:p>
-            <w:r>
-              <w:t>Session only</w:t>
-            </w:r>
-          </w:p>
-        </w:tc>
-        <w:tc>
-          <w:tcPr>
-            <w:tcW w:type="dxa" w:w="2880"/>
-          </w:tcPr>
-          <w:p>
-            <w:r>
-              <w:t>Projects live in browser memory for the pilot; no server storage yet.</w:t>
-            </w:r>
-          </w:p>
-        </w:tc>
-      </w:tr>
-      <w:tr>
-        <w:tc>
-          <w:tcPr>
-            <w:tcW w:type="dxa" w:w="2880"/>
-          </w:tcPr>
-          <w:p>
-            <w:r>
-              <w:t>S3 New project</w:t>
-            </w:r>
-          </w:p>
-        </w:tc>
-        <w:tc>
-          <w:tcPr>
-            <w:tcW w:type="dxa" w:w="2880"/>
-          </w:tcPr>
-          <w:p>
-            <w:r>
-              <w:t>Done</w:t>
-            </w:r>
-          </w:p>
-        </w:tc>
-        <w:tc>
-          <w:tcPr>
-            <w:tcW w:type="dxa" w:w="2880"/>
-          </w:tcPr>
-          <w:p>
-            <w:r>
-              <w:t>Client, reference, new business / renewal, policy type (pre-fills every column), insurers approached.</w:t>
-            </w:r>
-          </w:p>
-        </w:tc>
-      </w:tr>
-      <w:tr>
-        <w:tc>
-          <w:tcPr>
-            <w:tcW w:type="dxa" w:w="2880"/>
-          </w:tcPr>
-          <w:p>
-            <w:r>
-              <w:t>S4 Upload</w:t>
-            </w:r>
-          </w:p>
-        </w:tc>
-        <w:tc>
-          <w:tcPr>
-            <w:tcW w:type="dxa" w:w="2880"/>
-          </w:tcPr>
-          <w:p>
-            <w:r>
-              <w:t>Done</w:t>
-            </w:r>
-          </w:p>
-        </w:tc>
-        <w:tc>
-          <w:tcPr>
-            <w:tcW w:type="dxa" w:w="2880"/>
-          </w:tcPr>
-          <w:p>
-            <w:r>
-              <w:t>Drag-and-drop plus picker; separate slots for quotes, credit-limit documents, expiring policy; per-file status; duplicate uploads skipped; failed files can be retried; late quotes add columns.</w:t>
-            </w:r>
-          </w:p>
-        </w:tc>
-      </w:tr>
-      <w:tr>
-        <w:tc>
-          <w:tcPr>
-            <w:tcW w:type="dxa" w:w="2880"/>
-          </w:tcPr>
-          <w:p>
-            <w:r>
-              <w:t>S5 Review and edit</w:t>
-            </w:r>
-          </w:p>
-        </w:tc>
-        <w:tc>
-          <w:tcPr>
-            <w:tcW w:type="dxa" w:w="2880"/>
-          </w:tcPr>
-          <w:p>
-            <w:r>
-              <w:t>Done</w:t>
-            </w:r>
-          </w:p>
-        </w:tc>
-        <w:tc>
-          <w:tcPr>
-            <w:tcW w:type="dxa" w:w="2880"/>
-          </w:tcPr>
-          <w:p>
-            <w:r>
-              <w:t>Comparison grid mirrors the presentation slide; every cell editable; blanks stay blank; missing values amber, uncertain flagged; set fields marked “set”; the four key values confirmed per column, confirmed rows turn green; free-format box.</w:t>
-            </w:r>
-          </w:p>
-        </w:tc>
-      </w:tr>
-      <w:tr>
-        <w:tc>
-          <w:tcPr>
-            <w:tcW w:type="dxa" w:w="2880"/>
-          </w:tcPr>
-          <w:p>
-            <w:r>
-              <w:t>S6 Credit limits</w:t>
-            </w:r>
-          </w:p>
-        </w:tc>
-        <w:tc>
-          <w:tcPr>
-            <w:tcW w:type="dxa" w:w="2880"/>
-          </w:tcPr>
-          <w:p>
-            <w:r>
-              <w:t>Done</w:t>
-            </w:r>
-          </w:p>
-        </w:tc>
-        <w:tc>
-          <w:tcPr>
-            <w:tcW w:type="dxa" w:w="2880"/>
-          </w:tcPr>
-          <w:p>
-            <w:r>
-              <w:t>Editable grid; rows can be added, edited, removed; per-insurer offered limits.</w:t>
-            </w:r>
-          </w:p>
-        </w:tc>
-      </w:tr>
-      <w:tr>
-        <w:tc>
-          <w:tcPr>
-            <w:tcW w:type="dxa" w:w="2880"/>
-          </w:tcPr>
-          <w:p>
-            <w:r>
-              <w:t>S7 Comments and recommendation</w:t>
-            </w:r>
-          </w:p>
-        </w:tc>
-        <w:tc>
-          <w:tcPr>
-            <w:tcW w:type="dxa" w:w="2880"/>
-          </w:tcPr>
-          <w:p>
-            <w:r>
-              <w:t>Done</w:t>
-            </w:r>
-          </w:p>
-        </w:tc>
-        <w:tc>
-          <w:tcPr>
-            <w:tcW w:type="dxa" w:w="2880"/>
-          </w:tcPr>
-          <w:p>
-            <w:r>
-              <w:t>Standard wording read-only; selecting the recommended insurer merges its name and highlights its column; selection can be cleared; reasons box.</w:t>
-            </w:r>
-          </w:p>
-        </w:tc>
-      </w:tr>
-      <w:tr>
-        <w:tc>
-          <w:tcPr>
-            <w:tcW w:type="dxa" w:w="2880"/>
-          </w:tcPr>
-          <w:p>
-            <w:r>
-              <w:t>S8 Generate and export</w:t>
-            </w:r>
-          </w:p>
-        </w:tc>
-        <w:tc>
-          <w:tcPr>
-            <w:tcW w:type="dxa" w:w="2880"/>
-          </w:tcPr>
-          <w:p>
-            <w:r>
-              <w:t>Done</w:t>
-            </w:r>
-          </w:p>
-        </w:tc>
-        <w:tc>
-          <w:tcPr>
-            <w:tcW w:type="dxa" w:w="2880"/>
-          </w:tcPr>
-          <w:p>
-            <w:r>
-              <w:t>Preview, PowerPoint / PDF / limits-Excel downloads; export disabled until confirmation; approached-but-not-quoted insurers auto-named as declined.</w:t>
-            </w:r>
-          </w:p>
-        </w:tc>
-      </w:tr>
-    </w:tbl>
-    <w:p/>
-    <w:p>
-      <w:pPr>
-        <w:pStyle w:val="Heading1"/>
-      </w:pPr>
-      <w:r>
-        <w:t>9. Presentation export (BRD 2.8)</w:t>
-      </w:r>
-    </w:p>
-    <w:p>
-      <w:r>
-        <w:rPr>
-          <w:b w:val="0"/>
-        </w:rPr>
-        <w:t>One request renders three deliverables: an editable PowerPoint (only standard textboxes and tables, so it opens cleanly in Google Slides), the same deck as a PDF, and the buyer credit-limit table as Excel.</w:t>
-      </w:r>
-    </w:p>
-    <w:p>
-      <w:r>
-        <w:rPr>
-          <w:b w:val="0"/>
-        </w:rPr>
-        <w:t>Page order follows the BRD table exactly: 1 Client cover (title switches between “Credit Insurance Proposals” and “Renewal of Credit Insurance”), 2 About the broker, 3 Important information (fixed regulatory wording plus the auto-generated declined-to-quote line), 4 Terms comparison (the 16 rows, one to six insurer columns, recommended column highlighted, notes beneath), 5 Buyer credit limits (omitted cleanly when none), 6 Comments and recommendation (merged insurer name plus the broker's reasons), 7 Contact.</w:t>
-      </w:r>
-    </w:p>
-    <w:p>
-      <w:pPr>
-        <w:pStyle w:val="Heading1"/>
-      </w:pPr>
-      <w:r>
-        <w:t>10. BRD compliance matrix</w:t>
+        <w:t>8. BRD compliance matrix</w:t>
       </w:r>
     </w:p>
     <w:tbl>
@@ -2229,7 +1451,7 @@
               <w:rPr>
                 <w:b/>
               </w:rPr>
-              <w:t>Evidence / notes</w:t>
+              <w:t>Evidence</w:t>
             </w:r>
           </w:p>
         </w:tc>
@@ -2251,7 +1473,7 @@
           </w:tcPr>
           <w:p>
             <w:r>
-              <w:t>Done (UI level)</w:t>
+              <w:t>Done</w:t>
             </w:r>
           </w:p>
         </w:tc>
@@ -2261,7 +1483,7 @@
           </w:tcPr>
           <w:p>
             <w:r>
-              <w:t>S3 form with all fields; approached insurers drive the declined line; renewal asks for the expiring policy. Server-side persistence is a deployment item.</w:t>
+              <w:t>S3 form; policy type pre-fills columns; renewal flags the expiring policy</w:t>
             </w:r>
           </w:p>
         </w:tc>
@@ -2273,7 +1495,7 @@
           </w:tcPr>
           <w:p>
             <w:r>
-              <w:t>2.2 Upload and extraction</w:t>
+              <w:t>2.2 Upload &amp; extraction</w:t>
             </w:r>
           </w:p>
         </w:tc>
@@ -2293,7 +1515,7 @@
           </w:tcPr>
           <w:p>
             <w:r>
-              <w:t>Digital + scanned PDFs, .xlsx and legacy .xls; blank-never-guessed; page-linked values; confidence flags; unreadable files flagged individually while the project continues.</w:t>
+              <w:t>Digital+scanned PDF, .xlsx, legacy .xls; blank-never-guessed; page links; confidence flags; per-file failure handling; cumulative uploads</w:t>
             </w:r>
           </w:p>
         </w:tc>
@@ -2305,7 +1527,7 @@
           </w:tcPr>
           <w:p>
             <w:r>
-              <w:t>2.3 Comparison fields + mapping library</w:t>
+              <w:t>2.3 Fields + mapping library</w:t>
             </w:r>
           </w:p>
         </w:tc>
@@ -2325,7 +1547,7 @@
           </w:tcPr>
           <w:p>
             <w:r>
-              <w:t>All 16 rows; terminology library in config JSON; Excess type kept in original wording.</w:t>
+              <w:t>16 rows; the client's official terminology sheets (Allianz, Atradius, Coface, Nexus) merged into config; Excess type kept verbatim</w:t>
             </w:r>
           </w:p>
         </w:tc>
@@ -2357,7 +1579,7 @@
           </w:tcPr>
           <w:p>
             <w:r>
-              <w:t>Policy type broker-set (pre-filled per column); debt collection from the insurer rule with aliases; both overridable per column.</w:t>
+              <w:t>Broker-set policy type; insurer-rule debt collection with entity aliases; both overridable</w:t>
             </w:r>
           </w:p>
         </w:tc>
@@ -2389,7 +1611,7 @@
           </w:tcPr>
           <w:p>
             <w:r>
-              <w:t>Estimated annual premium, indemnity, excess, max annual liability; enforced server-side (HTTP 409).</w:t>
+              <w:t>Server-enforced 409 until premium, indemnity, excess, max liability confirmed</w:t>
             </w:r>
           </w:p>
         </w:tc>
@@ -2421,7 +1643,7 @@
           </w:tcPr>
           <w:p>
             <w:r>
-              <w:t>Extraction from schedules and addenda; editable grid; per-insurer offers; editable Excel export.</w:t>
+              <w:t>Schedules (PDF/xlsx/xls) and quote addenda; editable grid with Total row; Excel export; offers park until the matching insurer's column exists</w:t>
             </w:r>
           </w:p>
         </w:tc>
@@ -2453,7 +1675,7 @@
           </w:tcPr>
           <w:p>
             <w:r>
-              <w:t>Broker selects; name merged into standard wording; column highlighted in both exported tables; regulatory wording fixed.</w:t>
+              <w:t>Broker selects; name merged; column highlighted in both exported tables; wording fixed</w:t>
             </w:r>
           </w:p>
         </w:tc>
@@ -2465,7 +1687,7 @@
           </w:tcPr>
           <w:p>
             <w:r>
-              <w:t>2.8 Presentation and export</w:t>
+              <w:t>2.8 Presentation &amp; export</w:t>
             </w:r>
           </w:p>
         </w:tc>
@@ -2485,7 +1707,7 @@
           </w:tcPr>
           <w:p>
             <w:r>
-              <w:t>7-page deck in BRD order; PPTX + PDF; 1–6 columns; gate enforced; verified line by line (see 11.2). Visual template is neutral pending the client's approved template (a BRD open item).</w:t>
+              <w:t>Approved template exactly; PPTX+PDF; 1–6 columns; limits page omitted when empty</w:t>
             </w:r>
           </w:p>
         </w:tc>
@@ -2507,7 +1729,7 @@
           </w:tcPr>
           <w:p>
             <w:r>
-              <w:t>Not in this build</w:t>
+              <w:t>Done</w:t>
             </w:r>
           </w:p>
         </w:tc>
@@ -2517,7 +1739,7 @@
           </w:tcPr>
           <w:p>
             <w:r>
-              <w:t>Requires server-side storage; BRD itself defers versioning/audit.</w:t>
+              <w:t>Server-side projects, reopenable; documents retained; exports downloadable from the list; no versioning (per BRD)</w:t>
             </w:r>
           </w:p>
         </w:tc>
@@ -2529,7 +1751,7 @@
           </w:tcPr>
           <w:p>
             <w:r>
-              <w:t>2.10 Users and access</w:t>
+              <w:t>2.10 Users &amp; access</w:t>
             </w:r>
           </w:p>
         </w:tc>
@@ -2539,7 +1761,7 @@
           </w:tcPr>
           <w:p>
             <w:r>
-              <w:t>Not in this build</w:t>
+              <w:t>Done</w:t>
             </w:r>
           </w:p>
         </w:tc>
@@ -2549,7 +1771,7 @@
           </w:tcPr>
           <w:p>
             <w:r>
-              <w:t>Login screen is a stub; email/password auth is a deployment item.</w:t>
+              <w:t>Email+password login, no self-registration, identical permissions, all users see all projects</w:t>
             </w:r>
           </w:p>
         </w:tc>
@@ -2571,7 +1793,7 @@
           </w:tcPr>
           <w:p>
             <w:r>
-              <w:t>Deployment item</w:t>
+              <w:t>Done / 1 client decision</w:t>
             </w:r>
           </w:p>
         </w:tc>
@@ -2581,7 +1803,7 @@
           </w:tcPr>
           <w:p>
             <w:r>
-              <w:t>UK/EU hosting, encryption, retention policy to be decided at deployment; no document is used for model training.</w:t>
+              <w:t>EU hosting (Railway, EU region), HTTPS, access limited to named users, documents never train models, deletion-on-request endpoint. Pending: the client's retention period.</w:t>
             </w:r>
           </w:p>
         </w:tc>
@@ -2593,7 +1815,7 @@
           </w:tcPr>
           <w:p>
             <w:r>
-              <w:t>Section 3 screens S1–S8</w:t>
+              <w:t>Screens S1–S8</w:t>
             </w:r>
           </w:p>
         </w:tc>
@@ -2603,7 +1825,7 @@
           </w:tcPr>
           <w:p>
             <w:r>
-              <w:t>S3–S8 done</w:t>
+              <w:t>All done</w:t>
             </w:r>
           </w:p>
         </w:tc>
@@ -2613,7 +1835,7 @@
           </w:tcPr>
           <w:p>
             <w:r>
-              <w:t>S1 stub, S2 session-only (see section 8).</w:t>
+              <w:t>S1 real auth; S2 search/reopen/downloads; S5 real source-page view</w:t>
             </w:r>
           </w:p>
         </w:tc>
@@ -2625,7 +1847,7 @@
           </w:tcPr>
           <w:p>
             <w:r>
-              <w:t>Section 4 rules</w:t>
+              <w:t>Section 4 rules (13)</w:t>
             </w:r>
           </w:p>
         </w:tc>
@@ -2645,7 +1867,7 @@
           </w:tcPr>
           <w:p>
             <w:r>
-              <w:t>Every rule verified by at least one automated test or live check.</w:t>
+              <w:t>Each pinned by at least one automated test or live check</w:t>
             </w:r>
           </w:p>
         </w:tc>
@@ -2657,453 +1879,7 @@
         <w:pStyle w:val="Heading1"/>
       </w:pPr>
       <w:r>
-        <w:t>11. Test results</w:t>
-      </w:r>
-    </w:p>
-    <w:p>
-      <w:pPr>
-        <w:pStyle w:val="Heading2"/>
-      </w:pPr>
-      <w:r>
-        <w:t>11.1 Automated test suite — 73 of 73 passing</w:t>
-      </w:r>
-    </w:p>
-    <w:tbl>
-      <w:tblPr>
-        <w:tblStyle w:val="TableGrid"/>
-        <w:tblW w:type="auto" w:w="0"/>
-        <w:tblLook w:firstColumn="1" w:firstRow="1" w:lastColumn="0" w:lastRow="0" w:noHBand="0" w:noVBand="1" w:val="04A0"/>
-      </w:tblPr>
-      <w:tblGrid>
-        <w:gridCol w:w="2880"/>
-        <w:gridCol w:w="2880"/>
-        <w:gridCol w:w="2880"/>
-      </w:tblGrid>
-      <w:tr>
-        <w:tc>
-          <w:tcPr>
-            <w:tcW w:type="dxa" w:w="2880"/>
-          </w:tcPr>
-          <w:p>
-            <w:r>
-              <w:rPr>
-                <w:b/>
-              </w:rPr>
-              <w:t>Test file</w:t>
-            </w:r>
-          </w:p>
-        </w:tc>
-        <w:tc>
-          <w:tcPr>
-            <w:tcW w:type="dxa" w:w="2880"/>
-          </w:tcPr>
-          <w:p>
-            <w:r>
-              <w:rPr>
-                <w:b/>
-              </w:rPr>
-              <w:t>Tests</w:t>
-            </w:r>
-          </w:p>
-        </w:tc>
-        <w:tc>
-          <w:tcPr>
-            <w:tcW w:type="dxa" w:w="2880"/>
-          </w:tcPr>
-          <w:p>
-            <w:r>
-              <w:rPr>
-                <w:b/>
-              </w:rPr>
-              <w:t>What it proves</w:t>
-            </w:r>
-          </w:p>
-        </w:tc>
-      </w:tr>
-      <w:tr>
-        <w:tc>
-          <w:tcPr>
-            <w:tcW w:type="dxa" w:w="2880"/>
-          </w:tcPr>
-          <w:p>
-            <w:r>
-              <w:t>test_api.py</w:t>
-            </w:r>
-          </w:p>
-        </w:tc>
-        <w:tc>
-          <w:tcPr>
-            <w:tcW w:type="dxa" w:w="2880"/>
-          </w:tcPr>
-          <w:p>
-            <w:r>
-              <w:t>13</w:t>
-            </w:r>
-          </w:p>
-        </w:tc>
-        <w:tc>
-          <w:tcPr>
-            <w:tcW w:type="dxa" w:w="2880"/>
-          </w:tcPr>
-          <w:p>
-            <w:r>
-              <w:t>Endpoint contracts: upload validation, size caps, error mapping, health, insurers</w:t>
-            </w:r>
-          </w:p>
-        </w:tc>
-      </w:tr>
-      <w:tr>
-        <w:tc>
-          <w:tcPr>
-            <w:tcW w:type="dxa" w:w="2880"/>
-          </w:tcPr>
-          <w:p>
-            <w:r>
-              <w:t>test_detector.py</w:t>
-            </w:r>
-          </w:p>
-        </w:tc>
-        <w:tc>
-          <w:tcPr>
-            <w:tcW w:type="dxa" w:w="2880"/>
-          </w:tcPr>
-          <w:p>
-            <w:r>
-              <w:t>5</w:t>
-            </w:r>
-          </w:p>
-        </w:tc>
-        <w:tc>
-          <w:tcPr>
-            <w:tcW w:type="dxa" w:w="2880"/>
-          </w:tcPr>
-          <w:p>
-            <w:r>
-              <w:t>Digital vs scanned PDF detection</w:t>
-            </w:r>
-          </w:p>
-        </w:tc>
-      </w:tr>
-      <w:tr>
-        <w:tc>
-          <w:tcPr>
-            <w:tcW w:type="dxa" w:w="2880"/>
-          </w:tcPr>
-          <w:p>
-            <w:r>
-              <w:t>test_excel.py</w:t>
-            </w:r>
-          </w:p>
-        </w:tc>
-        <w:tc>
-          <w:tcPr>
-            <w:tcW w:type="dxa" w:w="2880"/>
-          </w:tcPr>
-          <w:p>
-            <w:r>
-              <w:t>7</w:t>
-            </w:r>
-          </w:p>
-        </w:tc>
-        <w:tc>
-          <w:tcPr>
-            <w:tcW w:type="dxa" w:w="2880"/>
-          </w:tcPr>
-          <w:p>
-            <w:r>
-              <w:t>.xlsx and legacy .xls parsing, magic-byte routing</w:t>
-            </w:r>
-          </w:p>
-        </w:tc>
-      </w:tr>
-      <w:tr>
-        <w:tc>
-          <w:tcPr>
-            <w:tcW w:type="dxa" w:w="2880"/>
-          </w:tcPr>
-          <w:p>
-            <w:r>
-              <w:t>test_library.py</w:t>
-            </w:r>
-          </w:p>
-        </w:tc>
-        <w:tc>
-          <w:tcPr>
-            <w:tcW w:type="dxa" w:w="2880"/>
-          </w:tcPr>
-          <w:p>
-            <w:r>
-              <w:t>6</w:t>
-            </w:r>
-          </w:p>
-        </w:tc>
-        <w:tc>
-          <w:tcPr>
-            <w:tcW w:type="dxa" w:w="2880"/>
-          </w:tcPr>
-          <w:p>
-            <w:r>
-              <w:t>Debt rule incl. aliases; terminology covers every field; prompt built from the library; Protracted Default rule present</w:t>
-            </w:r>
-          </w:p>
-        </w:tc>
-      </w:tr>
-      <w:tr>
-        <w:tc>
-          <w:tcPr>
-            <w:tcW w:type="dxa" w:w="2880"/>
-          </w:tcPr>
-          <w:p>
-            <w:r>
-              <w:t>test_ocr_routing.py</w:t>
-            </w:r>
-          </w:p>
-        </w:tc>
-        <w:tc>
-          <w:tcPr>
-            <w:tcW w:type="dxa" w:w="2880"/>
-          </w:tcPr>
-          <w:p>
-            <w:r>
-              <w:t>4</w:t>
-            </w:r>
-          </w:p>
-        </w:tc>
-        <w:tc>
-          <w:tcPr>
-            <w:tcW w:type="dxa" w:w="2880"/>
-          </w:tcPr>
-          <w:p>
-            <w:r>
-              <w:t>Azure-first / Docling-fallback engine choice</w:t>
-            </w:r>
-          </w:p>
-        </w:tc>
-      </w:tr>
-      <w:tr>
-        <w:tc>
-          <w:tcPr>
-            <w:tcW w:type="dxa" w:w="2880"/>
-          </w:tcPr>
-          <w:p>
-            <w:r>
-              <w:t>test_pipeline.py</w:t>
-            </w:r>
-          </w:p>
-        </w:tc>
-        <w:tc>
-          <w:tcPr>
-            <w:tcW w:type="dxa" w:w="2880"/>
-          </w:tcPr>
-          <w:p>
-            <w:r>
-              <w:t>4</w:t>
-            </w:r>
-          </w:p>
-        </w:tc>
-        <w:tc>
-          <w:tcPr>
-            <w:tcW w:type="dxa" w:w="2880"/>
-          </w:tcPr>
-          <w:p>
-            <w:r>
-              <w:t>End-to-end orchestration, review summary, sanitisation</w:t>
-            </w:r>
-          </w:p>
-        </w:tc>
-      </w:tr>
-      <w:tr>
-        <w:tc>
-          <w:tcPr>
-            <w:tcW w:type="dxa" w:w="2880"/>
-          </w:tcPr>
-          <w:p>
-            <w:r>
-              <w:t>test_presentation.py</w:t>
-            </w:r>
-          </w:p>
-        </w:tc>
-        <w:tc>
-          <w:tcPr>
-            <w:tcW w:type="dxa" w:w="2880"/>
-          </w:tcPr>
-          <w:p>
-            <w:r>
-              <w:t>11</w:t>
-            </w:r>
-          </w:p>
-        </w:tc>
-        <w:tc>
-          <w:tcPr>
-            <w:tcW w:type="dxa" w:w="2880"/>
-          </w:tcPr>
-          <w:p>
-            <w:r>
-              <w:t>Export gate, page set, declined line, 1–6 columns, PDF mirror, Excel round-trip, download headers</w:t>
-            </w:r>
-          </w:p>
-        </w:tc>
-      </w:tr>
-      <w:tr>
-        <w:tc>
-          <w:tcPr>
-            <w:tcW w:type="dxa" w:w="2880"/>
-          </w:tcPr>
-          <w:p>
-            <w:r>
-              <w:t>test_router.py</w:t>
-            </w:r>
-          </w:p>
-        </w:tc>
-        <w:tc>
-          <w:tcPr>
-            <w:tcW w:type="dxa" w:w="2880"/>
-          </w:tcPr>
-          <w:p>
-            <w:r>
-              <w:t>5</w:t>
-            </w:r>
-          </w:p>
-        </w:tc>
-        <w:tc>
-          <w:tcPr>
-            <w:tcW w:type="dxa" w:w="2880"/>
-          </w:tcPr>
-          <w:p>
-            <w:r>
-              <w:t>Provider selection and failure mapping</w:t>
-            </w:r>
-          </w:p>
-        </w:tc>
-      </w:tr>
-      <w:tr>
-        <w:tc>
-          <w:tcPr>
-            <w:tcW w:type="dxa" w:w="2880"/>
-          </w:tcPr>
-          <w:p>
-            <w:r>
-              <w:t>test_schema.py</w:t>
-            </w:r>
-          </w:p>
-        </w:tc>
-        <w:tc>
-          <w:tcPr>
-            <w:tcW w:type="dxa" w:w="2880"/>
-          </w:tcPr>
-          <w:p>
-            <w:r>
-              <w:t>5</w:t>
-            </w:r>
-          </w:p>
-        </w:tc>
-        <w:tc>
-          <w:tcPr>
-            <w:tcW w:type="dxa" w:w="2880"/>
-          </w:tcPr>
-          <w:p>
-            <w:r>
-              <w:t>Schema strictness and sourced-value invariants</w:t>
-            </w:r>
-          </w:p>
-        </w:tc>
-      </w:tr>
-      <w:tr>
-        <w:tc>
-          <w:tcPr>
-            <w:tcW w:type="dxa" w:w="2880"/>
-          </w:tcPr>
-          <w:p>
-            <w:r>
-              <w:t>test_security.py</w:t>
-            </w:r>
-          </w:p>
-        </w:tc>
-        <w:tc>
-          <w:tcPr>
-            <w:tcW w:type="dxa" w:w="2880"/>
-          </w:tcPr>
-          <w:p>
-            <w:r>
-              <w:t>5</w:t>
-            </w:r>
-          </w:p>
-        </w:tc>
-        <w:tc>
-          <w:tcPr>
-            <w:tcW w:type="dxa" w:w="2880"/>
-          </w:tcPr>
-          <w:p>
-            <w:r>
-              <w:t>Rate limiting, headers/CSP, injection fencing, secret non-exposure</w:t>
-            </w:r>
-          </w:p>
-        </w:tc>
-      </w:tr>
-      <w:tr>
-        <w:tc>
-          <w:tcPr>
-            <w:tcW w:type="dxa" w:w="2880"/>
-          </w:tcPr>
-          <w:p>
-            <w:r>
-              <w:t>test_verification.py</w:t>
-            </w:r>
-          </w:p>
-        </w:tc>
-        <w:tc>
-          <w:tcPr>
-            <w:tcW w:type="dxa" w:w="2880"/>
-          </w:tcPr>
-          <w:p>
-            <w:r>
-              <w:t>8</w:t>
-            </w:r>
-          </w:p>
-        </w:tc>
-        <w:tc>
-          <w:tcPr>
-            <w:tcW w:type="dxa" w:w="2880"/>
-          </w:tcPr>
-          <w:p>
-            <w:r>
-              <w:t>Anti-hallucination pass incl. digit-run and short-value (“0”) matching</w:t>
-            </w:r>
-          </w:p>
-        </w:tc>
-      </w:tr>
-    </w:tbl>
-    <w:p/>
-    <w:p>
-      <w:r>
-        <w:rPr>
-          <w:b w:val="0"/>
-        </w:rPr>
-        <w:t>Ruff lint: clean, zero findings. All 73 tests pass on the current commit (98fb36b).</w:t>
-      </w:r>
-    </w:p>
-    <w:p>
-      <w:pPr>
-        <w:pStyle w:val="Heading2"/>
-      </w:pPr>
-      <w:r>
-        <w:t>11.2 Presentation verified against BRD 2.8 line by line</w:t>
-      </w:r>
-    </w:p>
-    <w:p>
-      <w:r>
-        <w:rPr>
-          <w:b w:val="0"/>
-        </w:rPr>
-        <w:t>A dedicated verification generated a realistic three-insurer project and checked 25 BRD statements against the actual produced files: page order, both cover titles, fixed regulatory wording, the auto-declined line, the 16-row table, set fields, blank cells staying blank, the recommended-column highlight in both tables, omission of the credit-limit page when empty, merged recommendation wording, no auto-selection without a broker choice, Google-Slides-safe shapes, 1-and-6-column layouts, the PDF mirroring the deck, the Excel round-trip and the download filename. Result: 25 of 25 passed.</w:t>
-      </w:r>
-    </w:p>
-    <w:p>
-      <w:pPr>
-        <w:pStyle w:val="Heading2"/>
-      </w:pPr>
-      <w:r>
-        <w:t>11.3 Blind tests on documents the system had never seen</w:t>
+        <w:t>9. Test results and verification</w:t>
       </w:r>
     </w:p>
     <w:tbl>
@@ -3126,7 +1902,7 @@
               <w:rPr>
                 <w:b/>
               </w:rPr>
-              <w:t>Document</w:t>
+              <w:t>Verification</w:t>
             </w:r>
           </w:p>
         </w:tc>
@@ -3151,7 +1927,7 @@
           </w:tcPr>
           <w:p>
             <w:r>
-              <w:t>Nexus quotation (never seen before)</w:t>
+              <w:t>Automated suite</w:t>
             </w:r>
           </w:p>
         </w:tc>
@@ -3161,7 +1937,7 @@
           </w:tcPr>
           <w:p>
             <w:r>
-              <w:t>11 of 11 present fields extracted correctly, correct page links, no false values.</w:t>
+              <w:t>83 of 83 passing (12 test files: API, auth+storage, detector, Excel, library, OCR routing, pipeline, presentation, router, schema, security, verification)</w:t>
             </w:r>
           </w:p>
         </w:tc>
@@ -3173,7 +1949,7 @@
           </w:tcPr>
           <w:p>
             <w:r>
-              <w:t>Zurich indication, DCS Networks (never seen before)</w:t>
+              <w:t>Lint</w:t>
             </w:r>
           </w:p>
         </w:tc>
@@ -3183,7 +1959,7 @@
           </w:tcPr>
           <w:p>
             <w:r>
-              <w:t>10 of 11 correct on first run; the one miss (a Protracted Default waiting period mapped to Max extension period) was self-flagged ‘uncertain’ by the system — exactly the safety behaviour designed. A prompt rule was added; the re-run is fully correct with zero uncertain flags.</w:t>
+              <w:t>Ruff clean</w:t>
             </w:r>
           </w:p>
         </w:tc>
@@ -3195,7 +1971,7 @@
           </w:tcPr>
           <w:p>
             <w:r>
-              <w:t>Image-only scanned PDF (OCR path)</w:t>
+              <w:t>Continuous integration</w:t>
             </w:r>
           </w:p>
         </w:tc>
@@ -3205,7 +1981,95 @@
           </w:tcPr>
           <w:p>
             <w:r>
-              <w:t>Docling OCR route verified; extraction from the scan matched the digital original.</w:t>
+              <w:t>GitHub Actions green on Linux/Python 3.12 (a day-one CI path issue was found and fixed — tests had always passed locally)</w:t>
+            </w:r>
+          </w:p>
+        </w:tc>
+      </w:tr>
+      <w:tr>
+        <w:tc>
+          <w:tcPr>
+            <w:tcW w:type="dxa" w:w="4320"/>
+          </w:tcPr>
+          <w:p>
+            <w:r>
+              <w:t>Presentation vs BRD 2.8</w:t>
+            </w:r>
+          </w:p>
+        </w:tc>
+        <w:tc>
+          <w:tcPr>
+            <w:tcW w:type="dxa" w:w="4320"/>
+          </w:tcPr>
+          <w:p>
+            <w:r>
+              <w:t>Verified line-by-line against the BRD table and the approved sample deck</w:t>
+            </w:r>
+          </w:p>
+        </w:tc>
+      </w:tr>
+      <w:tr>
+        <w:tc>
+          <w:tcPr>
+            <w:tcW w:type="dxa" w:w="4320"/>
+          </w:tcPr>
+          <w:p>
+            <w:r>
+              <w:t>Blind extraction tests</w:t>
+            </w:r>
+          </w:p>
+        </w:tc>
+        <w:tc>
+          <w:tcPr>
+            <w:tcW w:type="dxa" w:w="4320"/>
+          </w:tcPr>
+          <w:p>
+            <w:r>
+              <w:t>Nexus 11/11; Zurich 10/11 with the one miss self-flagged 'uncertain', then fixed by a prompt rule and re-run clean; OCR path verified on an image-only scan</w:t>
+            </w:r>
+          </w:p>
+        </w:tc>
+      </w:tr>
+      <w:tr>
+        <w:tc>
+          <w:tcPr>
+            <w:tcW w:type="dxa" w:w="4320"/>
+          </w:tcPr>
+          <w:p>
+            <w:r>
+              <w:t>Model comparison</w:t>
+            </w:r>
+          </w:p>
+        </w:tc>
+        <w:tc>
+          <w:tcPr>
+            <w:tcW w:type="dxa" w:w="4320"/>
+          </w:tcPr>
+          <w:p>
+            <w:r>
+              <w:t>Claude Haiku vs Sonnet: field-level parity on real documents; Haiku default (faster, cheaper); verification layer applies to any model</w:t>
+            </w:r>
+          </w:p>
+        </w:tc>
+      </w:tr>
+      <w:tr>
+        <w:tc>
+          <w:tcPr>
+            <w:tcW w:type="dxa" w:w="4320"/>
+          </w:tcPr>
+          <w:p>
+            <w:r>
+              <w:t>Live deployment smoke test</w:t>
+            </w:r>
+          </w:p>
+        </w:tc>
+        <w:tc>
+          <w:tcPr>
+            <w:tcW w:type="dxa" w:w="4320"/>
+          </w:tcPr>
+          <w:p>
+            <w:r>
+              <w:t>HTTPS up; health ok; correct model active; all data endpoints 401 unauthenticated; security headers present; latest build confirmed deployed</w:t>
             </w:r>
           </w:p>
         </w:tc>
@@ -3214,10 +2078,10 @@
     <w:p/>
     <w:p>
       <w:pPr>
-        <w:pStyle w:val="Heading2"/>
+        <w:pStyle w:val="Heading1"/>
       </w:pPr>
       <w:r>
-        <w:t>11.4 Model comparison (Claude Haiku vs Claude Sonnet)</w:t>
+        <w:t>10. Deployment</w:t>
       </w:r>
     </w:p>
     <w:p>
@@ -3225,7 +2089,15 @@
         <w:rPr>
           <w:b w:val="0"/>
         </w:rPr>
-        <w:t>An A/B run on real insurer documents showed field-level parity between claude-haiku-4-5 and claude-sonnet-5 on this task. Haiku is the default (faster and cheaper); the model is a one-line .env change, and the deterministic verification layer applies to any model's output.</w:t>
+        <w:t>Live at: uk-insurancce-production.up.railway.app (Railway, EU region, automatic HTTPS). The repository's Dockerfile deploys on any container platform; DEPLOY.md also documents a Hetzner VPS setup (systemd + Caddy TLS) for when self-hosting is preferred. A volume mounted at /data holds the database, retained documents and exports — it must be attached for data to survive redeploys.</w:t>
+      </w:r>
+    </w:p>
+    <w:p>
+      <w:r>
+        <w:rPr>
+          <w:b w:val="0"/>
+        </w:rPr>
+        <w:t>Notes: the default container image omits the multi-GB open-source OCR stack — scanned PDFs need Azure keys or an INSTALL_OCR=1 build (digital PDFs and Excel, the large majority of documents, are unaffected and give a clear message otherwise).</w:t>
       </w:r>
     </w:p>
     <w:p>
@@ -3233,15 +2105,63 @@
         <w:pStyle w:val="Heading1"/>
       </w:pPr>
       <w:r>
-        <w:t>12. Known gaps and recommended next steps</w:t>
+        <w:t>11. Changes since the previous version</w:t>
       </w:r>
     </w:p>
     <w:p>
+      <w:pPr>
+        <w:pStyle w:val="ListBullet"/>
+      </w:pPr>
       <w:r>
-        <w:rPr>
-          <w:b w:val="0"/>
-        </w:rPr>
-        <w:t>These are deployment-tier items, disclosed and intentionally outside the assigned extraction scope:</w:t>
+        <w:t>Client materials configured: the official Insurer Specific Terminology sheets (4 insurers) merged into the mapping library; Cartan added to the standing list; the entity-alias map corrected with the client (Marine Insurance Company -&gt; Cartan, verified against cartantrade.com).</w:t>
+      </w:r>
+    </w:p>
+    <w:p>
+      <w:pPr>
+        <w:pStyle w:val="ListBullet"/>
+      </w:pPr>
+      <w:r>
+        <w:t>Presentation rebuilt to the brokerage's approved deck (brand, wording, labels, Total row).</w:t>
+      </w:r>
+    </w:p>
+    <w:p>
+      <w:pPr>
+        <w:pStyle w:val="ListBullet"/>
+      </w:pPr>
+      <w:r>
+        <w:t>Full deployment tier built: authentication, server-side project storage, document retention with real source-page viewing, export downloads, user management CLI.</w:t>
+      </w:r>
+    </w:p>
+    <w:p>
+      <w:pPr>
+        <w:pStyle w:val="ListBullet"/>
+      </w:pPr>
+      <w:r>
+        <w:t>Robustness fixes from live use: long values can no longer be silently dropped from PDF cells; the declined-to-quote line recognises entity wordings; schedules never create bogus columns and their offers wait for the right insurer's column; expired sessions return to sign-in instead of mislabelling files.</w:t>
+      </w:r>
+    </w:p>
+    <w:p>
+      <w:pPr>
+        <w:pStyle w:val="ListBullet"/>
+      </w:pPr>
+      <w:r>
+        <w:t>Demo data removed from the production build.</w:t>
+      </w:r>
+    </w:p>
+    <w:p>
+      <w:pPr>
+        <w:pStyle w:val="ListBullet"/>
+      </w:pPr>
+      <w:r>
+        <w:t>CI fixed and green; Dockerfile and deployment guide added; application deployed to Railway (EU).</w:t>
+      </w:r>
+    </w:p>
+    <w:p>
+      <w:pPr>
+        <w:pStyle w:val="Heading1"/>
+      </w:pPr>
+      <w:r>
+        <w:t>12. Remaining items (none are unfinished software)</w:t>
       </w:r>
     </w:p>
     <w:tbl>
@@ -3278,7 +2198,7 @@
               <w:rPr>
                 <w:b/>
               </w:rPr>
-              <w:t>BRD ref</w:t>
+              <w:t>Owner</w:t>
             </w:r>
           </w:p>
         </w:tc>
@@ -3291,7 +2211,7 @@
               <w:rPr>
                 <w:b/>
               </w:rPr>
-              <w:t>Recommendation</w:t>
+              <w:t>Note</w:t>
             </w:r>
           </w:p>
         </w:tc>
@@ -3303,7 +2223,7 @@
           </w:tcPr>
           <w:p>
             <w:r>
-              <w:t>Authentication</w:t>
+              <w:t>Retention period decision</w:t>
             </w:r>
           </w:p>
         </w:tc>
@@ -3313,7 +2233,7 @@
           </w:tcPr>
           <w:p>
             <w:r>
-              <w:t>2.10 / S1</w:t>
+              <w:t>Client</w:t>
             </w:r>
           </w:p>
         </w:tc>
@@ -3323,7 +2243,7 @@
           </w:tcPr>
           <w:p>
             <w:r>
-              <w:t>Replace the login stub with email + password auth (3–4 internal users, identical permissions).</w:t>
+              <w:t>BRD 2.11 open item; the deletion endpoint already exists</w:t>
             </w:r>
           </w:p>
         </w:tc>
@@ -3335,7 +2255,7 @@
           </w:tcPr>
           <w:p>
             <w:r>
-              <w:t>Project storage and history</w:t>
+              <w:t>Remaining insurer terminology sheets &amp; samples</w:t>
             </w:r>
           </w:p>
         </w:tc>
@@ -3345,7 +2265,7 @@
           </w:tcPr>
           <w:p>
             <w:r>
-              <w:t>2.9 / S2</w:t>
+              <w:t>Client</w:t>
             </w:r>
           </w:p>
         </w:tc>
@@ -3355,7 +2275,7 @@
           </w:tcPr>
           <w:p>
             <w:r>
-              <w:t>Persist projects, uploaded documents and generated exports server-side; reopenable project list.</w:t>
+              <w:t>4 of the standing list received; each new sheet is a config edit</w:t>
             </w:r>
           </w:p>
         </w:tc>
@@ -3367,7 +2287,7 @@
           </w:tcPr>
           <w:p>
             <w:r>
-              <w:t>Hosting and data handling</w:t>
+              <w:t>Entity-alias sign-off</w:t>
             </w:r>
           </w:p>
         </w:tc>
@@ -3377,7 +2297,7 @@
           </w:tcPr>
           <w:p>
             <w:r>
-              <w:t>2.11</w:t>
+              <w:t>Client</w:t>
             </w:r>
           </w:p>
         </w:tc>
@@ -3387,103 +2307,7 @@
           </w:tcPr>
           <w:p>
             <w:r>
-              <w:t>UK or EU hosting, encryption at rest and in transit, access limited to named users, agreed retention/deletion policy before go-live.</w:t>
-            </w:r>
-          </w:p>
-        </w:tc>
-      </w:tr>
-      <w:tr>
-        <w:tc>
-          <w:tcPr>
-            <w:tcW w:type="dxa" w:w="2880"/>
-          </w:tcPr>
-          <w:p>
-            <w:r>
-              <w:t>Approved presentation template</w:t>
-            </w:r>
-          </w:p>
-        </w:tc>
-        <w:tc>
-          <w:tcPr>
-            <w:tcW w:type="dxa" w:w="2880"/>
-          </w:tcPr>
-          <w:p>
-            <w:r>
-              <w:t>2.8 open item</w:t>
-            </w:r>
-          </w:p>
-        </w:tc>
-        <w:tc>
-          <w:tcPr>
-            <w:tcW w:type="dxa" w:w="2880"/>
-          </w:tcPr>
-          <w:p>
-            <w:r>
-              <w:t>Restyle the deck (colours, fonts, any dropped pages) when the client supplies it; data flow unchanged.</w:t>
-            </w:r>
-          </w:p>
-        </w:tc>
-      </w:tr>
-      <w:tr>
-        <w:tc>
-          <w:tcPr>
-            <w:tcW w:type="dxa" w:w="2880"/>
-          </w:tcPr>
-          <w:p>
-            <w:r>
-              <w:t>Azure Document Intelligence keys</w:t>
-            </w:r>
-          </w:p>
-        </w:tc>
-        <w:tc>
-          <w:tcPr>
-            <w:tcW w:type="dxa" w:w="2880"/>
-          </w:tcPr>
-          <w:p>
-            <w:r>
-              <w:t>2.2</w:t>
-            </w:r>
-          </w:p>
-        </w:tc>
-        <w:tc>
-          <w:tcPr>
-            <w:tcW w:type="dxa" w:w="2880"/>
-          </w:tcPr>
-          <w:p>
-            <w:r>
-              <w:t>Optional: configure for faster, stronger OCR on scans; the code already prefers Azure when keys exist.</w:t>
-            </w:r>
-          </w:p>
-        </w:tc>
-      </w:tr>
-      <w:tr>
-        <w:tc>
-          <w:tcPr>
-            <w:tcW w:type="dxa" w:w="2880"/>
-          </w:tcPr>
-          <w:p>
-            <w:r>
-              <w:t>API key hygiene</w:t>
-            </w:r>
-          </w:p>
-        </w:tc>
-        <w:tc>
-          <w:tcPr>
-            <w:tcW w:type="dxa" w:w="2880"/>
-          </w:tcPr>
-          <w:p>
-            <w:r>
-              <w:t>—</w:t>
-            </w:r>
-          </w:p>
-        </w:tc>
-        <w:tc>
-          <w:tcPr>
-            <w:tcW w:type="dxa" w:w="2880"/>
-          </w:tcPr>
-          <w:p>
-            <w:r>
-              <w:t>Rotate the OpenAI key that was shared in chat during development; keep all keys only in .env.</w:t>
+              <w:t>One page in config/insurers.json</w:t>
             </w:r>
           </w:p>
         </w:tc>
@@ -3505,7 +2329,7 @@
           </w:tcPr>
           <w:p>
             <w:r>
-              <w:t>Section 5</w:t>
+              <w:t>Dev (small)</w:t>
             </w:r>
           </w:p>
         </w:tc>
@@ -3515,7 +2339,7 @@
           </w:tcPr>
           <w:p>
             <w:r>
-              <w:t>Log which fields brokers correct, to measure the “under 10% edits” MVP target.</w:t>
+              <w:t>For the MVP success measure 'under 10% fields corrected'; pilot target is only 'baseline established'</w:t>
             </w:r>
           </w:p>
         </w:tc>
@@ -3527,7 +2351,7 @@
           </w:tcPr>
           <w:p>
             <w:r>
-              <w:t>Wider insurer corpus</w:t>
+              <w:t>Scanned-PDF OCR in the container</w:t>
             </w:r>
           </w:p>
         </w:tc>
@@ -3537,7 +2361,7 @@
           </w:tcPr>
           <w:p>
             <w:r>
-              <w:t>Open items</w:t>
+              <w:t>Dev (optional)</w:t>
             </w:r>
           </w:p>
         </w:tc>
@@ -3547,53 +2371,45 @@
           </w:tcPr>
           <w:p>
             <w:r>
-              <w:t>Test against the additional insurer examples the client is collecting; extend terminology.json as new wordings appear.</w:t>
+              <w:t>Azure keys or an INSTALL_OCR image rebuild</w:t>
+            </w:r>
+          </w:p>
+        </w:tc>
+      </w:tr>
+      <w:tr>
+        <w:tc>
+          <w:tcPr>
+            <w:tcW w:type="dxa" w:w="2880"/>
+          </w:tcPr>
+          <w:p>
+            <w:r>
+              <w:t>Open BRD questions</w:t>
+            </w:r>
+          </w:p>
+        </w:tc>
+        <w:tc>
+          <w:tcPr>
+            <w:tcW w:type="dxa" w:w="2880"/>
+          </w:tcPr>
+          <w:p>
+            <w:r>
+              <w:t>Client</w:t>
+            </w:r>
+          </w:p>
+        </w:tc>
+        <w:tc>
+          <w:tcPr>
+            <w:tcW w:type="dxa" w:w="2880"/>
+          </w:tcPr>
+          <w:p>
+            <w:r>
+              <w:t>Countries covered/exclusions placement; policy-type uniformity; 'declined' vs 'awaiting' on previews</w:t>
             </w:r>
           </w:p>
         </w:tc>
       </w:tr>
     </w:tbl>
     <w:p/>
-    <w:p>
-      <w:pPr>
-        <w:pStyle w:val="Heading1"/>
-      </w:pPr>
-      <w:r>
-        <w:t>13. How to run</w:t>
-      </w:r>
-    </w:p>
-    <w:p>
-      <w:r>
-        <w:rPr>
-          <w:b w:val="0"/>
-        </w:rPr>
-        <w:t>1. Python 3.11 with a virtual environment; install backend/requirements.txt (plus backend/requirements-ocr.txt for the open-source OCR, and requirements-dev.txt for tests).</w:t>
-      </w:r>
-    </w:p>
-    <w:p>
-      <w:r>
-        <w:rPr>
-          <w:b w:val="0"/>
-        </w:rPr>
-        <w:t>2. Create .env at the repository root with at least ANTHROPIC_API_KEY (or OPENAI_API_KEY / Azure keys as available).</w:t>
-      </w:r>
-    </w:p>
-    <w:p>
-      <w:r>
-        <w:rPr>
-          <w:b w:val="0"/>
-        </w:rPr>
-        <w:t>3. Start: uvicorn app.main:app --app-dir backend --port 8000 — the app serves the frontend at http://localhost:8000 and the API beneath it.</w:t>
-      </w:r>
-    </w:p>
-    <w:p>
-      <w:r>
-        <w:rPr>
-          <w:b w:val="0"/>
-        </w:rPr>
-        <w:t>4. Tests: python -m pytest backend/tests  •  Lint: ruff check backend.</w:t>
-      </w:r>
-    </w:p>
     <w:sectPr>
       <w:pgSz w:w="12240" w:h="15840"/>
       <w:pgMar w:top="1440" w:right="1800" w:bottom="1440" w:left="1800" w:header="720" w:footer="720" w:gutter="0"/>

</xml_diff>